<commit_message>
docs: finalize writer delivery guide
</commit_message>
<xml_diff>
--- a/docs/walkthrough/Guia_entrega_articulos_Orbita.docx
+++ b/docs/walkthrough/Guia_entrega_articulos_Orbita.docx
@@ -74,6 +74,10 @@
     <w:p>
       <w:pPr>
         <w:pStyle w:val="ListNumber"/>
+        <w:numPr>
+          <w:ilvl w:val="0"/>
+          <w:numId w:val="10"/>
+        </w:numPr>
       </w:pPr>
       <w:r>
         <w:rPr>
@@ -99,6 +103,10 @@
     <w:p>
       <w:pPr>
         <w:pStyle w:val="ListNumber"/>
+        <w:numPr>
+          <w:ilvl w:val="0"/>
+          <w:numId w:val="10"/>
+        </w:numPr>
       </w:pPr>
       <w:r>
         <w:rPr>
@@ -124,6 +132,10 @@
     <w:p>
       <w:pPr>
         <w:pStyle w:val="ListNumber"/>
+        <w:numPr>
+          <w:ilvl w:val="0"/>
+          <w:numId w:val="10"/>
+        </w:numPr>
       </w:pPr>
       <w:r>
         <w:rPr>
@@ -149,6 +161,10 @@
     <w:p>
       <w:pPr>
         <w:pStyle w:val="ListNumber"/>
+        <w:numPr>
+          <w:ilvl w:val="0"/>
+          <w:numId w:val="10"/>
+        </w:numPr>
       </w:pPr>
       <w:r>
         <w:rPr>
@@ -174,6 +190,10 @@
     <w:p>
       <w:pPr>
         <w:pStyle w:val="ListNumber"/>
+        <w:numPr>
+          <w:ilvl w:val="0"/>
+          <w:numId w:val="10"/>
+        </w:numPr>
       </w:pPr>
       <w:r>
         <w:rPr>
@@ -1640,6 +1660,10 @@
     <w:p>
       <w:pPr>
         <w:pStyle w:val="ListNumber"/>
+        <w:numPr>
+          <w:ilvl w:val="0"/>
+          <w:numId w:val="11"/>
+        </w:numPr>
       </w:pPr>
       <w:r>
         <w:rPr>
@@ -1665,6 +1689,10 @@
     <w:p>
       <w:pPr>
         <w:pStyle w:val="ListNumber"/>
+        <w:numPr>
+          <w:ilvl w:val="0"/>
+          <w:numId w:val="11"/>
+        </w:numPr>
       </w:pPr>
       <w:r>
         <w:rPr>
@@ -1690,6 +1718,10 @@
     <w:p>
       <w:pPr>
         <w:pStyle w:val="ListNumber"/>
+        <w:numPr>
+          <w:ilvl w:val="0"/>
+          <w:numId w:val="11"/>
+        </w:numPr>
       </w:pPr>
       <w:r>
         <w:rPr>
@@ -2087,6 +2119,18 @@
   </w:num>
   <w:num w:numId="9">
     <w:abstractNumId w:val="0"/>
+  </w:num>
+  <w:num w:numId="10">
+    <w:abstractNumId w:val="7"/>
+    <w:lvlOverride w:ilvl="0">
+      <w:startOverride w:val="1"/>
+    </w:lvlOverride>
+  </w:num>
+  <w:num w:numId="11">
+    <w:abstractNumId w:val="7"/>
+    <w:lvlOverride w:ilvl="0">
+      <w:startOverride w:val="1"/>
+    </w:lvlOverride>
   </w:num>
 </w:numbering>
 </file>

</xml_diff>

<commit_message>
feat: integrate secure newsletter
</commit_message>
<xml_diff>
--- a/docs/walkthrough/Guia_entrega_articulos_Orbita.docx
+++ b/docs/walkthrough/Guia_entrega_articulos_Orbita.docx
@@ -14,7 +14,7 @@
           <w:color w:val="C8463A"/>
           <w:sz w:val="20"/>
         </w:rPr>
-        <w:t>GUÍA DE COLABORACIÓN</w:t>
+        <w:t>GUIA DE COLABORACION</w:t>
       </w:r>
     </w:p>
     <w:p>
@@ -22,7 +22,7 @@
         <w:pStyle w:val="Title"/>
       </w:pPr>
       <w:r>
-        <w:t>Cómo entregar tu artículo a Órbita</w:t>
+        <w:t>Como entregar tu articulo a Orbita</w:t>
       </w:r>
     </w:p>
     <w:p>
@@ -30,7 +30,7 @@
         <w:pStyle w:val="Subtitle"/>
       </w:pPr>
       <w:r>
-        <w:t>Una carpeta, una plantilla sencilla y todas tus imágenes listas para publicar.</w:t>
+        <w:t>Una carpeta, una plantilla, una vista previa y el editor publica.</w:t>
       </w:r>
     </w:p>
     <w:p>
@@ -50,7 +50,7 @@
           <w:color w:val="506AB8"/>
           <w:sz w:val="19"/>
         </w:rPr>
-        <w:t xml:space="preserve">LO MÁS IMPORTANTE  </w:t>
+        <w:t xml:space="preserve">LO MAS IMPORTANTE  </w:t>
       </w:r>
       <w:r>
         <w:rPr>
@@ -60,7 +60,7 @@
           <w:color w:val="171B23"/>
           <w:sz w:val="21"/>
         </w:rPr>
-        <w:t>No necesitas saber de páginas web. Entrega una carpeta ordenada; el equipo editorial se encarga de revisar, dar formato y publicar.</w:t>
+        <w:t>No necesitas saber de paginas web ni tener acceso al CMS. Entrega una carpeta ordenada con tus archivos; el equipo editorial revisa, corrige y publica.</w:t>
       </w:r>
     </w:p>
     <w:p>
@@ -97,7 +97,7 @@
           <w:color w:val="171B23"/>
           <w:sz w:val="22"/>
         </w:rPr>
-        <w:t>Ponle un nombre corto relacionado con tu artículo.</w:t>
+        <w:t>Ponle un nombre corto relacionado con tu articulo.</w:t>
       </w:r>
     </w:p>
     <w:p>
@@ -126,7 +126,7 @@
           <w:color w:val="171B23"/>
           <w:sz w:val="22"/>
         </w:rPr>
-        <w:t>Guárdala como articulo.txt o articulo.md dentro de la carpeta.</w:t>
+        <w:t>Guardala como articulo.txt o articulo.md dentro de la carpeta.</w:t>
       </w:r>
     </w:p>
     <w:p>
@@ -155,7 +155,7 @@
           <w:color w:val="171B23"/>
           <w:sz w:val="22"/>
         </w:rPr>
-        <w:t>Completa TÍTULO, AUTOR, CATEGORÍA, BAJADA y, si aplica, EDICIÓN.</w:t>
+        <w:t>Completa TITULO, AUTOR, CATEGORIA, SUBTITULO y TIEMPO DE LECTURA.</w:t>
       </w:r>
     </w:p>
     <w:p>
@@ -174,7 +174,7 @@
           <w:color w:val="171B23"/>
           <w:sz w:val="22"/>
         </w:rPr>
-        <w:t xml:space="preserve">Agrega tus imágenes. </w:t>
+        <w:t xml:space="preserve">Agrega tus imagenes. </w:t>
       </w:r>
       <w:r>
         <w:rPr>
@@ -203,7 +203,7 @@
           <w:color w:val="171B23"/>
           <w:sz w:val="22"/>
         </w:rPr>
-        <w:t xml:space="preserve">Comprime y envía. </w:t>
+        <w:t xml:space="preserve">Comprime y envia. </w:t>
       </w:r>
       <w:r>
         <w:rPr>
@@ -213,7 +213,7 @@
           <w:color w:val="171B23"/>
           <w:sz w:val="22"/>
         </w:rPr>
-        <w:t>Convierte la carpeta en un archivo .zip y mándalo al responsable editorial.</w:t>
+        <w:t>Convierte la carpeta en un archivo .zip y mandalo al responsable editorial.</w:t>
       </w:r>
     </w:p>
     <w:p>
@@ -221,7 +221,7 @@
         <w:pStyle w:val="Heading2"/>
       </w:pPr>
       <w:r>
-        <w:t>Qué hará el editor</w:t>
+        <w:t>Que hara el editor</w:t>
       </w:r>
     </w:p>
     <w:p>
@@ -236,7 +236,7 @@
           <w:color w:val="171B23"/>
           <w:sz w:val="22"/>
         </w:rPr>
-        <w:t>Revisará el texto y abrirá una vista previa antes de publicar.</w:t>
+        <w:t>Revisara el texto y abrira una vista previa antes de publicar.</w:t>
       </w:r>
     </w:p>
     <w:p>
@@ -251,7 +251,7 @@
           <w:color w:val="171B23"/>
           <w:sz w:val="22"/>
         </w:rPr>
-        <w:t>Subirá las imágenes y conservará los pies de foto que escribiste.</w:t>
+        <w:t>Subira las imagenes y conservara los pies de foto que escribiste.</w:t>
       </w:r>
     </w:p>
     <w:p>
@@ -266,7 +266,7 @@
           <w:color w:val="171B23"/>
           <w:sz w:val="22"/>
         </w:rPr>
-        <w:t>Te avisará si falta un dato o si una imagen necesita mayor resolución.</w:t>
+        <w:t>Te avisara si falta un dato o si una imagen necesita mayor resolucion.</w:t>
       </w:r>
     </w:p>
     <w:p>
@@ -281,7 +281,7 @@
           <w:color w:val="5F6878"/>
           <w:sz w:val="20"/>
         </w:rPr>
-        <w:t>Tiempo para preparar la entrega: normalmente 5 a 10 minutos después de terminar el texto.</w:t>
+        <w:t>Tiempo para preparar la entrega: normalmente 5 a 10 minutos despues de terminar el texto.</w:t>
       </w:r>
     </w:p>
     <w:p>
@@ -309,7 +309,7 @@
           <w:color w:val="171B23"/>
           <w:sz w:val="22"/>
         </w:rPr>
-        <w:t>La carpeta evita que se pierdan imágenes, nombres o leyendas. Todo lo necesario para publicar debe quedar dentro.</w:t>
+        <w:t>La carpeta evita que se pierdan imagenes, nombres o leyendas. Todo lo necesario para publicar debe quedar dentro.</w:t>
       </w:r>
     </w:p>
     <w:p>
@@ -352,7 +352,7 @@
           <w:color w:val="171B23"/>
           <w:sz w:val="17"/>
         </w:rPr>
-        <w:t xml:space="preserve">  articulo.txt</w:t>
+        <w:t xml:space="preserve">  articulo.md</w:t>
       </w:r>
       <w:r>
         <w:br/>
@@ -408,7 +408,92 @@
           <w:color w:val="171B23"/>
           <w:sz w:val="21"/>
         </w:rPr>
-        <w:t>Usa letras, números y guiones. Evita nombres como IMG_0042 final FINAL.jpg. Prefiere foto-del-evento.jpg.</w:t>
+        <w:t>Solo caracteres seguros: letras sin acento, numeros y guiones. Nada de espacios, enies, signos de puntuacion ni caracteres especiales.</w:t>
+      </w:r>
+    </w:p>
+    <w:p>
+      <w:pPr>
+        <w:pStyle w:val="ListBullet"/>
+      </w:pPr>
+      <w:r>
+        <w:rPr>
+          <w:rFonts w:ascii="Calibri" w:hAnsi="Calibri"/>
+          <w:b w:val="0"/>
+          <w:i w:val="0"/>
+          <w:color w:val="171B23"/>
+          <w:sz w:val="22"/>
+        </w:rPr>
+        <w:t>Un solo archivo de texto por articulo (articulo.md o articulo.txt).</w:t>
+      </w:r>
+    </w:p>
+    <w:p>
+      <w:pPr>
+        <w:pStyle w:val="ListBullet"/>
+      </w:pPr>
+      <w:r>
+        <w:rPr>
+          <w:rFonts w:ascii="Calibri" w:hAnsi="Calibri"/>
+          <w:b w:val="0"/>
+          <w:i w:val="0"/>
+          <w:color w:val="171B23"/>
+          <w:sz w:val="22"/>
+        </w:rPr>
+        <w:t>Imagenes en JPG, PNG o WebP. Hasta 10 MB cada una.</w:t>
+      </w:r>
+    </w:p>
+    <w:p>
+      <w:pPr>
+        <w:pStyle w:val="ListBullet"/>
+      </w:pPr>
+      <w:r>
+        <w:rPr>
+          <w:rFonts w:ascii="Calibri" w:hAnsi="Calibri"/>
+          <w:b w:val="0"/>
+          <w:i w:val="0"/>
+          <w:color w:val="171B23"/>
+          <w:sz w:val="22"/>
+        </w:rPr>
+        <w:t>Todos los archivos dentro de la misma carpeta, sin subcarpetas complejas.</w:t>
+      </w:r>
+    </w:p>
+    <w:p>
+      <w:pPr>
+        <w:pStyle w:val="ListBullet"/>
+      </w:pPr>
+      <w:r>
+        <w:rPr>
+          <w:rFonts w:ascii="Calibri" w:hAnsi="Calibri"/>
+          <w:b/>
+          <w:i w:val="0"/>
+          <w:color w:val="171B23"/>
+          <w:sz w:val="22"/>
+        </w:rPr>
+        <w:t xml:space="preserve">Nombres de archivo: </w:t>
+      </w:r>
+      <w:r>
+        <w:rPr>
+          <w:rFonts w:ascii="Calibri" w:hAnsi="Calibri"/>
+          <w:b w:val="0"/>
+          <w:i w:val="0"/>
+          <w:color w:val="171B23"/>
+          <w:sz w:val="22"/>
+        </w:rPr>
+        <w:t>solo a-z, 0-9 y guiones. Nada de espacios, acentos, enies, signos de puntuacion ni caracteres especiales. Ejemplo bueno: equipo-lanzamiento.jpg. Ejemplo malo: IMG_0042 final FINAL.jpg (tiene espacios).</w:t>
+      </w:r>
+    </w:p>
+    <w:p>
+      <w:pPr>
+        <w:pStyle w:val="ListBullet"/>
+      </w:pPr>
+      <w:r>
+        <w:rPr>
+          <w:rFonts w:ascii="Calibri" w:hAnsi="Calibri"/>
+          <w:b w:val="0"/>
+          <w:i w:val="0"/>
+          <w:color w:val="171B23"/>
+          <w:sz w:val="22"/>
+        </w:rPr>
+        <w:t>El nombre en RUTA debe coincidir exactamente con el archivo dentro de la carpeta, incluyendo la extension.</w:t>
       </w:r>
     </w:p>
     <w:p>
@@ -417,6 +502,36 @@
       </w:pPr>
       <w:r>
         <w:t>2. Copia esta plantilla</w:t>
+      </w:r>
+    </w:p>
+    <w:p>
+      <w:pPr>
+        <w:spacing w:before="0" w:after="120" w:line="300" w:lineRule="auto"/>
+      </w:pPr>
+      <w:r>
+        <w:rPr>
+          <w:rFonts w:ascii="Calibri" w:hAnsi="Calibri"/>
+          <w:b w:val="0"/>
+          <w:i w:val="0"/>
+          <w:color w:val="171B23"/>
+          <w:sz w:val="22"/>
+        </w:rPr>
+        <w:t>Completa los campos de la parte superior y escribe el cuerpo debajo del separador ---. No borres ni modifiques los nombres de los campos.</w:t>
+      </w:r>
+    </w:p>
+    <w:p>
+      <w:pPr>
+        <w:spacing w:before="0" w:after="60" w:line="300" w:lineRule="auto"/>
+      </w:pPr>
+      <w:r>
+        <w:rPr>
+          <w:rFonts w:ascii="Calibri" w:hAnsi="Calibri"/>
+          <w:b w:val="0"/>
+          <w:i w:val="0"/>
+          <w:color w:val="506AB8"/>
+          <w:sz w:val="19"/>
+        </w:rPr>
+        <w:t>PLANTILLA COMPLETA -- COPIA ESTE BLOQUE</w:t>
       </w:r>
     </w:p>
     <w:p>
@@ -431,7 +546,7 @@
           <w:color w:val="171B23"/>
           <w:sz w:val="17"/>
         </w:rPr>
-        <w:t>TÍTULO:</w:t>
+        <w:t>TITULO: La primera mision de nuestro equipo CanSat</w:t>
       </w:r>
       <w:r>
         <w:br/>
@@ -444,7 +559,7 @@
           <w:color w:val="171B23"/>
           <w:sz w:val="17"/>
         </w:rPr>
-        <w:t>AUTOR:</w:t>
+        <w:t>AUTOR: Andrea Perez Lopez</w:t>
       </w:r>
       <w:r>
         <w:br/>
@@ -457,7 +572,7 @@
           <w:color w:val="171B23"/>
           <w:sz w:val="17"/>
         </w:rPr>
-        <w:t>CATEGORÍA:</w:t>
+        <w:t>CATEGORIA: Ingenieria</w:t>
       </w:r>
       <w:r>
         <w:br/>
@@ -470,7 +585,7 @@
           <w:color w:val="171B23"/>
           <w:sz w:val="17"/>
         </w:rPr>
-        <w:t>BAJADA:</w:t>
+        <w:t>SUBTITULO: Disenar un satelite del tamano de una lata nos enseno a</w:t>
       </w:r>
       <w:r>
         <w:br/>
@@ -483,7 +598,33 @@
           <w:color w:val="171B23"/>
           <w:sz w:val="17"/>
         </w:rPr>
-        <w:t>EDICIÓN:</w:t>
+        <w:t xml:space="preserve">  convertir limites reales en decisiones de ingenieria.</w:t>
+      </w:r>
+      <w:r>
+        <w:br/>
+      </w:r>
+      <w:r>
+        <w:rPr>
+          <w:rFonts w:ascii="Courier New" w:hAnsi="Courier New"/>
+          <w:b w:val="0"/>
+          <w:i w:val="0"/>
+          <w:color w:val="171B23"/>
+          <w:sz w:val="17"/>
+        </w:rPr>
+        <w:t>EDICION: julio-2026</w:t>
+      </w:r>
+      <w:r>
+        <w:br/>
+      </w:r>
+      <w:r>
+        <w:rPr>
+          <w:rFonts w:ascii="Courier New" w:hAnsi="Courier New"/>
+          <w:b w:val="0"/>
+          <w:i w:val="0"/>
+          <w:color w:val="171B23"/>
+          <w:sz w:val="17"/>
+        </w:rPr>
+        <w:t>TIEMPO DE LECTURA: 8</w:t>
       </w:r>
       <w:r>
         <w:br/>
@@ -533,7 +674,7 @@
           <w:color w:val="171B23"/>
           <w:sz w:val="17"/>
         </w:rPr>
-        <w:t>## Primer subtítulo</w:t>
+        <w:t>## Primer subtitulo</w:t>
       </w:r>
       <w:r>
         <w:br/>
@@ -558,7 +699,7 @@
           <w:color w:val="171B23"/>
           <w:sz w:val="17"/>
         </w:rPr>
-        <w:t>Escribe aquí tu primer párrafo.</w:t>
+        <w:t>Escribe aqui tu primer parrafo. Deja una linea vacia entre parrafos.</w:t>
       </w:r>
       <w:r>
         <w:br/>
@@ -608,7 +749,7 @@
           <w:color w:val="171B23"/>
           <w:sz w:val="17"/>
         </w:rPr>
-        <w:t>## Segundo subtítulo</w:t>
+        <w:t>## Segundo subtitulo</w:t>
       </w:r>
       <w:r>
         <w:br/>
@@ -633,7 +774,7 @@
           <w:color w:val="171B23"/>
           <w:sz w:val="17"/>
         </w:rPr>
-        <w:t>Continúa aquí el artículo.</w:t>
+        <w:t>Continua aqui el articulo.</w:t>
       </w:r>
       <w:r>
         <w:br/>
@@ -671,7 +812,7 @@
           <w:color w:val="171B23"/>
           <w:sz w:val="17"/>
         </w:rPr>
-        <w:t>RUTA: nombre-exacto-de-la-imagen.jpg</w:t>
+        <w:t>RUTA: foto-del-evento.webp</w:t>
       </w:r>
       <w:r>
         <w:br/>
@@ -684,7 +825,20 @@
           <w:color w:val="171B23"/>
           <w:sz w:val="17"/>
         </w:rPr>
-        <w:t>PIE DE FOTO: Explica qué aparece, dónde y quién tomó la foto.</w:t>
+        <w:t>PIE DE FOTO: Explica que aparece, donde ocurre, quien participa y quien</w:t>
+      </w:r>
+      <w:r>
+        <w:br/>
+      </w:r>
+      <w:r>
+        <w:rPr>
+          <w:rFonts w:ascii="Courier New" w:hAnsi="Courier New"/>
+          <w:b w:val="0"/>
+          <w:i w:val="0"/>
+          <w:color w:val="171B23"/>
+          <w:sz w:val="17"/>
+        </w:rPr>
+        <w:t xml:space="preserve">  tomo la foto.</w:t>
       </w:r>
       <w:r>
         <w:br/>
@@ -709,7 +863,7 @@
           <w:color w:val="171B23"/>
           <w:sz w:val="17"/>
         </w:rPr>
-        <w:t>## Conclusión</w:t>
+        <w:t>## Conclusion</w:t>
       </w:r>
       <w:r>
         <w:br/>
@@ -739,167 +893,6 @@
     </w:p>
     <w:p>
       <w:pPr>
-        <w:spacing w:before="0" w:after="120" w:line="300" w:lineRule="auto"/>
-      </w:pPr>
-      <w:r>
-        <w:rPr>
-          <w:rFonts w:ascii="Calibri" w:hAnsi="Calibri"/>
-          <w:b w:val="0"/>
-          <w:i/>
-          <w:color w:val="5F6878"/>
-          <w:sz w:val="20"/>
-        </w:rPr>
-        <w:t>Guarda el archivo como articulo.txt o articulo.md. No hace falta cambiar tipografías, colores ni márgenes.</w:t>
-      </w:r>
-    </w:p>
-    <w:p>
-      <w:r>
-        <w:br w:type="page"/>
-      </w:r>
-    </w:p>
-    <w:p>
-      <w:pPr>
-        <w:pStyle w:val="Heading1"/>
-      </w:pPr>
-      <w:r>
-        <w:t>3. Escribe el artículo</w:t>
-      </w:r>
-    </w:p>
-    <w:p>
-      <w:pPr>
-        <w:pStyle w:val="Heading2"/>
-      </w:pPr>
-      <w:r>
-        <w:t>Datos de la parte superior</w:t>
-      </w:r>
-    </w:p>
-    <w:p>
-      <w:pPr>
-        <w:pStyle w:val="ListBullet"/>
-      </w:pPr>
-      <w:r>
-        <w:rPr>
-          <w:rFonts w:ascii="Calibri" w:hAnsi="Calibri"/>
-          <w:b/>
-          <w:i w:val="0"/>
-          <w:color w:val="171B23"/>
-          <w:sz w:val="22"/>
-        </w:rPr>
-        <w:t>TÍTULO:</w:t>
-      </w:r>
-      <w:r>
-        <w:rPr>
-          <w:rFonts w:ascii="Calibri" w:hAnsi="Calibri"/>
-          <w:b w:val="0"/>
-          <w:i w:val="0"/>
-          <w:color w:val="171B23"/>
-          <w:sz w:val="22"/>
-        </w:rPr>
-        <w:t xml:space="preserve"> obligatorio. Usa el título que quieres que vea el lector.</w:t>
-      </w:r>
-    </w:p>
-    <w:p>
-      <w:pPr>
-        <w:pStyle w:val="ListBullet"/>
-      </w:pPr>
-      <w:r>
-        <w:rPr>
-          <w:rFonts w:ascii="Calibri" w:hAnsi="Calibri"/>
-          <w:b/>
-          <w:i w:val="0"/>
-          <w:color w:val="171B23"/>
-          <w:sz w:val="22"/>
-        </w:rPr>
-        <w:t>AUTOR:</w:t>
-      </w:r>
-      <w:r>
-        <w:rPr>
-          <w:rFonts w:ascii="Calibri" w:hAnsi="Calibri"/>
-          <w:b w:val="0"/>
-          <w:i w:val="0"/>
-          <w:color w:val="171B23"/>
-          <w:sz w:val="22"/>
-        </w:rPr>
-        <w:t xml:space="preserve"> obligatorio. Escribe tu nombre completo.</w:t>
-      </w:r>
-    </w:p>
-    <w:p>
-      <w:pPr>
-        <w:pStyle w:val="ListBullet"/>
-      </w:pPr>
-      <w:r>
-        <w:rPr>
-          <w:rFonts w:ascii="Calibri" w:hAnsi="Calibri"/>
-          <w:b/>
-          <w:i w:val="0"/>
-          <w:color w:val="171B23"/>
-          <w:sz w:val="22"/>
-        </w:rPr>
-        <w:t>CATEGORÍA:</w:t>
-      </w:r>
-      <w:r>
-        <w:rPr>
-          <w:rFonts w:ascii="Calibri" w:hAnsi="Calibri"/>
-          <w:b w:val="0"/>
-          <w:i w:val="0"/>
-          <w:color w:val="171B23"/>
-          <w:sz w:val="22"/>
-        </w:rPr>
-        <w:t xml:space="preserve"> obligatoria. Ejemplos: Ingeniería, Entrevista, Aeroespacial, Investigación o Comunidad.</w:t>
-      </w:r>
-    </w:p>
-    <w:p>
-      <w:pPr>
-        <w:pStyle w:val="ListBullet"/>
-      </w:pPr>
-      <w:r>
-        <w:rPr>
-          <w:rFonts w:ascii="Calibri" w:hAnsi="Calibri"/>
-          <w:b/>
-          <w:i w:val="0"/>
-          <w:color w:val="171B23"/>
-          <w:sz w:val="22"/>
-        </w:rPr>
-        <w:t>BAJADA:</w:t>
-      </w:r>
-      <w:r>
-        <w:rPr>
-          <w:rFonts w:ascii="Calibri" w:hAnsi="Calibri"/>
-          <w:b w:val="0"/>
-          <w:i w:val="0"/>
-          <w:color w:val="171B23"/>
-          <w:sz w:val="22"/>
-        </w:rPr>
-        <w:t xml:space="preserve"> una o dos frases que resumen la historia y despiertan interés.</w:t>
-      </w:r>
-    </w:p>
-    <w:p>
-      <w:pPr>
-        <w:pStyle w:val="ListBullet"/>
-      </w:pPr>
-      <w:r>
-        <w:rPr>
-          <w:rFonts w:ascii="Calibri" w:hAnsi="Calibri"/>
-          <w:b/>
-          <w:i w:val="0"/>
-          <w:color w:val="171B23"/>
-          <w:sz w:val="22"/>
-        </w:rPr>
-        <w:t>EDICIÓN:</w:t>
-      </w:r>
-      <w:r>
-        <w:rPr>
-          <w:rFonts w:ascii="Calibri" w:hAnsi="Calibri"/>
-          <w:b w:val="0"/>
-          <w:i w:val="0"/>
-          <w:color w:val="171B23"/>
-          <w:sz w:val="22"/>
-        </w:rPr>
-        <w:t xml:space="preserve"> opcional. Déjala vacía si el editor no te indicó una edición.</w:t>
-      </w:r>
-    </w:p>
-    <w:p>
-      <w:pPr>
         <w:spacing w:before="100" w:after="200" w:line="288" w:lineRule="auto"/>
         <w:ind w:left="259" w:right="173"/>
         <w:shd w:fill="FCEEEB"/>
@@ -915,7 +908,7 @@
           <w:color w:val="C8463A"/>
           <w:sz w:val="19"/>
         </w:rPr>
-        <w:t xml:space="preserve">NO BORRES ESTA LÍNEA  </w:t>
+        <w:t xml:space="preserve">IMPORTANTE  </w:t>
       </w:r>
       <w:r>
         <w:rPr>
@@ -925,7 +918,20 @@
           <w:color w:val="171B23"/>
           <w:sz w:val="21"/>
         </w:rPr>
-        <w:t>El separador --- debe ir solo en una línea entre los datos y el cuerpo del artículo.</w:t>
+        <w:t>Usa SUBTITULO, no BAJADA. TIEMPO DE LECTURA debe ser un numero entero entre 1 y 90 minutos. El editor podra ajustarlo.</w:t>
+      </w:r>
+    </w:p>
+    <w:p>
+      <w:r>
+        <w:br w:type="page"/>
+      </w:r>
+    </w:p>
+    <w:p>
+      <w:pPr>
+        <w:pStyle w:val="Heading1"/>
+      </w:pPr>
+      <w:r>
+        <w:t>3. Escribe el articulo</w:t>
       </w:r>
     </w:p>
     <w:p>
@@ -933,7 +939,210 @@
         <w:pStyle w:val="Heading2"/>
       </w:pPr>
       <w:r>
-        <w:t>Señales sencillas dentro del texto</w:t>
+        <w:t>Campos obligatorios y opcionales</w:t>
+      </w:r>
+    </w:p>
+    <w:p>
+      <w:pPr>
+        <w:pStyle w:val="ListBullet"/>
+      </w:pPr>
+      <w:r>
+        <w:rPr>
+          <w:rFonts w:ascii="Calibri" w:hAnsi="Calibri"/>
+          <w:b/>
+          <w:i w:val="0"/>
+          <w:color w:val="171B23"/>
+          <w:sz w:val="22"/>
+        </w:rPr>
+        <w:t xml:space="preserve">TITULO: </w:t>
+      </w:r>
+      <w:r>
+        <w:rPr>
+          <w:rFonts w:ascii="Calibri" w:hAnsi="Calibri"/>
+          <w:b w:val="0"/>
+          <w:i w:val="0"/>
+          <w:color w:val="171B23"/>
+          <w:sz w:val="22"/>
+        </w:rPr>
+        <w:t>obligatorio. El titulo que veran los lectores.</w:t>
+      </w:r>
+    </w:p>
+    <w:p>
+      <w:pPr>
+        <w:pStyle w:val="ListBullet"/>
+      </w:pPr>
+      <w:r>
+        <w:rPr>
+          <w:rFonts w:ascii="Calibri" w:hAnsi="Calibri"/>
+          <w:b/>
+          <w:i w:val="0"/>
+          <w:color w:val="171B23"/>
+          <w:sz w:val="22"/>
+        </w:rPr>
+        <w:t xml:space="preserve">AUTOR: </w:t>
+      </w:r>
+      <w:r>
+        <w:rPr>
+          <w:rFonts w:ascii="Calibri" w:hAnsi="Calibri"/>
+          <w:b w:val="0"/>
+          <w:i w:val="0"/>
+          <w:color w:val="171B23"/>
+          <w:sz w:val="22"/>
+        </w:rPr>
+        <w:t>obligatorio. Tu nombre completo.</w:t>
+      </w:r>
+    </w:p>
+    <w:p>
+      <w:pPr>
+        <w:pStyle w:val="ListBullet"/>
+      </w:pPr>
+      <w:r>
+        <w:rPr>
+          <w:rFonts w:ascii="Calibri" w:hAnsi="Calibri"/>
+          <w:b/>
+          <w:i w:val="0"/>
+          <w:color w:val="171B23"/>
+          <w:sz w:val="22"/>
+        </w:rPr>
+        <w:t xml:space="preserve">CATEGORIA: </w:t>
+      </w:r>
+      <w:r>
+        <w:rPr>
+          <w:rFonts w:ascii="Calibri" w:hAnsi="Calibri"/>
+          <w:b w:val="0"/>
+          <w:i w:val="0"/>
+          <w:color w:val="171B23"/>
+          <w:sz w:val="22"/>
+        </w:rPr>
+        <w:t>obligatoria. Ejemplos: Ingenieria, Entrevista, Aeroespacial, Investigacion o Comunidad.</w:t>
+      </w:r>
+    </w:p>
+    <w:p>
+      <w:pPr>
+        <w:pStyle w:val="ListBullet"/>
+      </w:pPr>
+      <w:r>
+        <w:rPr>
+          <w:rFonts w:ascii="Calibri" w:hAnsi="Calibri"/>
+          <w:b/>
+          <w:i w:val="0"/>
+          <w:color w:val="171B23"/>
+          <w:sz w:val="22"/>
+        </w:rPr>
+        <w:t xml:space="preserve">SUBTITULO: </w:t>
+      </w:r>
+      <w:r>
+        <w:rPr>
+          <w:rFonts w:ascii="Calibri" w:hAnsi="Calibri"/>
+          <w:b w:val="0"/>
+          <w:i w:val="0"/>
+          <w:color w:val="171B23"/>
+          <w:sz w:val="22"/>
+        </w:rPr>
+        <w:t>una o dos frases que resumen la historia y despiertan interes. Tambien se acepta BAJADA si prefieres ese nombre.</w:t>
+      </w:r>
+    </w:p>
+    <w:p>
+      <w:pPr>
+        <w:pStyle w:val="ListBullet"/>
+      </w:pPr>
+      <w:r>
+        <w:rPr>
+          <w:rFonts w:ascii="Calibri" w:hAnsi="Calibri"/>
+          <w:b/>
+          <w:i w:val="0"/>
+          <w:color w:val="171B23"/>
+          <w:sz w:val="22"/>
+        </w:rPr>
+        <w:t xml:space="preserve">EDICION: </w:t>
+      </w:r>
+      <w:r>
+        <w:rPr>
+          <w:rFonts w:ascii="Calibri" w:hAnsi="Calibri"/>
+          <w:b w:val="0"/>
+          <w:i w:val="0"/>
+          <w:color w:val="171B23"/>
+          <w:sz w:val="22"/>
+        </w:rPr>
+        <w:t>opcional. Dejala vacia si el editor no te indico una edicion.</w:t>
+      </w:r>
+    </w:p>
+    <w:p>
+      <w:pPr>
+        <w:pStyle w:val="ListBullet"/>
+      </w:pPr>
+      <w:r>
+        <w:rPr>
+          <w:rFonts w:ascii="Calibri" w:hAnsi="Calibri"/>
+          <w:b/>
+          <w:i w:val="0"/>
+          <w:color w:val="171B23"/>
+          <w:sz w:val="22"/>
+        </w:rPr>
+        <w:t xml:space="preserve">TIEMPO DE LECTURA: </w:t>
+      </w:r>
+      <w:r>
+        <w:rPr>
+          <w:rFonts w:ascii="Calibri" w:hAnsi="Calibri"/>
+          <w:b w:val="0"/>
+          <w:i w:val="0"/>
+          <w:color w:val="171B23"/>
+          <w:sz w:val="22"/>
+        </w:rPr>
+        <w:t>opcional. Un numero entero que indica los minutos estimados. Si no lo pones, el editor lo calculara.</w:t>
+      </w:r>
+    </w:p>
+    <w:p>
+      <w:pPr>
+        <w:spacing w:before="100" w:after="200" w:line="288" w:lineRule="auto"/>
+        <w:ind w:left="259" w:right="173"/>
+        <w:shd w:fill="E8EEF9"/>
+        <w:pBdr>
+          <w:left w:val="single" w:sz="18" w:space="8" w:color="506AB8"/>
+        </w:pBdr>
+      </w:pPr>
+      <w:r>
+        <w:rPr>
+          <w:rFonts w:ascii="Calibri" w:hAnsi="Calibri"/>
+          <w:b/>
+          <w:i w:val="0"/>
+          <w:color w:val="506AB8"/>
+          <w:sz w:val="19"/>
+        </w:rPr>
+        <w:t xml:space="preserve">ESTIMAR EL TIEMPO DE LECTURA  </w:t>
+      </w:r>
+      <w:r>
+        <w:rPr>
+          <w:rFonts w:ascii="Calibri" w:hAnsi="Calibri"/>
+          <w:b w:val="0"/>
+          <w:i w:val="0"/>
+          <w:color w:val="171B23"/>
+          <w:sz w:val="21"/>
+        </w:rPr>
+        <w:t>Cuenta las palabras de tu articulo y divide entre 200. Ejemplo: 1,600 palabras / 200 = 8 minutos. Redondea al entero mas cercano. Escribe solo el numero, sin minutos ni comas.</w:t>
+      </w:r>
+    </w:p>
+    <w:p>
+      <w:pPr>
+        <w:pStyle w:val="Heading2"/>
+      </w:pPr>
+      <w:r>
+        <w:t>El separador ---</w:t>
+      </w:r>
+    </w:p>
+    <w:p>
+      <w:pPr>
+        <w:spacing w:before="0" w:after="120" w:line="300" w:lineRule="auto"/>
+      </w:pPr>
+      <w:r>
+        <w:rPr>
+          <w:rFonts w:ascii="Calibri" w:hAnsi="Calibri"/>
+          <w:b w:val="0"/>
+          <w:i w:val="0"/>
+          <w:color w:val="171B23"/>
+          <w:sz w:val="22"/>
+        </w:rPr>
+        <w:t>La linea --- debe ir sola, en su propia linea, entre los metadatos y el cuerpo del articulo. Si la borras, el sistema no podra procesar el archivo.</w:t>
       </w:r>
     </w:p>
     <w:p>
@@ -948,296 +1157,7 @@
           <w:color w:val="171B23"/>
           <w:sz w:val="17"/>
         </w:rPr>
-        <w:t>## Un subtítulo</w:t>
-      </w:r>
-      <w:r>
-        <w:br/>
-      </w:r>
-      <w:r>
-        <w:rPr>
-          <w:rFonts w:ascii="Courier New" w:hAnsi="Courier New"/>
-          <w:b w:val="0"/>
-          <w:i w:val="0"/>
-          <w:color w:val="171B23"/>
-          <w:sz w:val="17"/>
-        </w:rPr>
-      </w:r>
-      <w:r>
-        <w:br/>
-      </w:r>
-      <w:r>
-        <w:rPr>
-          <w:rFonts w:ascii="Courier New" w:hAnsi="Courier New"/>
-          <w:b w:val="0"/>
-          <w:i w:val="0"/>
-          <w:color w:val="171B23"/>
-          <w:sz w:val="17"/>
-        </w:rPr>
-        <w:t>&gt; Una cita destacada</w:t>
-      </w:r>
-    </w:p>
-    <w:p>
-      <w:pPr>
-        <w:pStyle w:val="ListBullet"/>
-      </w:pPr>
-      <w:r>
-        <w:rPr>
-          <w:rFonts w:ascii="Calibri" w:hAnsi="Calibri"/>
-          <w:b w:val="0"/>
-          <w:i w:val="0"/>
-          <w:color w:val="171B23"/>
-          <w:sz w:val="22"/>
-        </w:rPr>
-        <w:t>Dos signos ## convierten esa línea en subtítulo.</w:t>
-      </w:r>
-    </w:p>
-    <w:p>
-      <w:pPr>
-        <w:pStyle w:val="ListBullet"/>
-      </w:pPr>
-      <w:r>
-        <w:rPr>
-          <w:rFonts w:ascii="Calibri" w:hAnsi="Calibri"/>
-          <w:b w:val="0"/>
-          <w:i w:val="0"/>
-          <w:color w:val="171B23"/>
-          <w:sz w:val="22"/>
-        </w:rPr>
-        <w:t>El signo &gt; al inicio convierte la frase en una cita destacada.</w:t>
-      </w:r>
-    </w:p>
-    <w:p>
-      <w:pPr>
-        <w:pStyle w:val="ListBullet"/>
-      </w:pPr>
-      <w:r>
-        <w:rPr>
-          <w:rFonts w:ascii="Calibri" w:hAnsi="Calibri"/>
-          <w:b w:val="0"/>
-          <w:i w:val="0"/>
-          <w:color w:val="171B23"/>
-          <w:sz w:val="22"/>
-        </w:rPr>
-        <w:t>Deja una línea vacía entre párrafos para que el texto sea fácil de revisar.</w:t>
-      </w:r>
-    </w:p>
-    <w:p>
-      <w:pPr>
-        <w:pStyle w:val="Heading1"/>
-      </w:pPr>
-      <w:r>
-        <w:t>Imágenes y pies de foto</w:t>
-      </w:r>
-    </w:p>
-    <w:p>
-      <w:pPr>
-        <w:spacing w:before="0" w:after="120" w:line="300" w:lineRule="auto"/>
-      </w:pPr>
-      <w:r>
-        <w:rPr>
-          <w:rFonts w:ascii="Calibri" w:hAnsi="Calibri"/>
-          <w:b w:val="0"/>
-          <w:i w:val="0"/>
-          <w:color w:val="171B23"/>
-          <w:sz w:val="22"/>
-        </w:rPr>
-        <w:t>Coloca el bloque exactamente en el lugar donde quieres que aparezca la imagen. Cada dato ocupa una sola línea.</w:t>
-      </w:r>
-    </w:p>
-    <w:p>
-      <w:pPr>
-        <w:pStyle w:val="CodeBlock"/>
-      </w:pPr>
-      <w:r>
-        <w:rPr>
-          <w:rFonts w:ascii="Courier New" w:hAnsi="Courier New"/>
-          <w:b w:val="0"/>
-          <w:i w:val="0"/>
-          <w:color w:val="171B23"/>
-          <w:sz w:val="17"/>
-        </w:rPr>
-        <w:t>[IMAGEN 1]</w:t>
-      </w:r>
-      <w:r>
-        <w:br/>
-      </w:r>
-      <w:r>
-        <w:rPr>
-          <w:rFonts w:ascii="Courier New" w:hAnsi="Courier New"/>
-          <w:b w:val="0"/>
-          <w:i w:val="0"/>
-          <w:color w:val="171B23"/>
-          <w:sz w:val="17"/>
-        </w:rPr>
-        <w:t>RUTA: foto-del-evento.webp</w:t>
-      </w:r>
-      <w:r>
-        <w:br/>
-      </w:r>
-      <w:r>
-        <w:rPr>
-          <w:rFonts w:ascii="Courier New" w:hAnsi="Courier New"/>
-          <w:b w:val="0"/>
-          <w:i w:val="0"/>
-          <w:color w:val="171B23"/>
-          <w:sz w:val="17"/>
-        </w:rPr>
-        <w:t>PIE DE FOTO: El equipo prepara el CanSat antes del lanzamiento. Foto: Ana López.</w:t>
-      </w:r>
-    </w:p>
-    <w:p>
-      <w:pPr>
-        <w:pStyle w:val="ListBullet"/>
-      </w:pPr>
-      <w:r>
-        <w:rPr>
-          <w:rFonts w:ascii="Calibri" w:hAnsi="Calibri"/>
-          <w:b w:val="0"/>
-          <w:i w:val="0"/>
-          <w:color w:val="171B23"/>
-          <w:sz w:val="22"/>
-        </w:rPr>
-        <w:t>Numera en orden: [IMAGEN 1], [IMAGEN 2], [IMAGEN 3]...</w:t>
-      </w:r>
-    </w:p>
-    <w:p>
-      <w:pPr>
-        <w:pStyle w:val="ListBullet"/>
-      </w:pPr>
-      <w:r>
-        <w:rPr>
-          <w:rFonts w:ascii="Calibri" w:hAnsi="Calibri"/>
-          <w:b w:val="0"/>
-          <w:i w:val="0"/>
-          <w:color w:val="171B23"/>
-          <w:sz w:val="22"/>
-        </w:rPr>
-        <w:t>RUTA debe coincidir exactamente con el archivo dentro de la carpeta.</w:t>
-      </w:r>
-    </w:p>
-    <w:p>
-      <w:pPr>
-        <w:pStyle w:val="ListBullet"/>
-      </w:pPr>
-      <w:r>
-        <w:rPr>
-          <w:rFonts w:ascii="Calibri" w:hAnsi="Calibri"/>
-          <w:b w:val="0"/>
-          <w:i w:val="0"/>
-          <w:color w:val="171B23"/>
-          <w:sz w:val="22"/>
-        </w:rPr>
-        <w:t>El pie debe explicar qué ocurre, identificar personas relevantes y dar crédito cuando corresponda.</w:t>
-      </w:r>
-    </w:p>
-    <w:p>
-      <w:pPr>
-        <w:pStyle w:val="ListBullet"/>
-      </w:pPr>
-      <w:r>
-        <w:rPr>
-          <w:rFonts w:ascii="Calibri" w:hAnsi="Calibri"/>
-          <w:b w:val="0"/>
-          <w:i w:val="0"/>
-          <w:color w:val="171B23"/>
-          <w:sz w:val="22"/>
-        </w:rPr>
-        <w:t>Envía JPG, PNG o WebP en la mayor resolución disponible. No pegues capturas dentro del documento.</w:t>
-      </w:r>
-    </w:p>
-    <w:p>
-      <w:r>
-        <w:br w:type="page"/>
-      </w:r>
-    </w:p>
-    <w:p>
-      <w:pPr>
-        <w:pStyle w:val="Heading1"/>
-      </w:pPr>
-      <w:r>
-        <w:t>4. Ejemplo completo</w:t>
-      </w:r>
-    </w:p>
-    <w:p>
-      <w:pPr>
-        <w:spacing w:before="0" w:after="120" w:line="300" w:lineRule="auto"/>
-      </w:pPr>
-      <w:r>
-        <w:rPr>
-          <w:rFonts w:ascii="Calibri" w:hAnsi="Calibri"/>
-          <w:b w:val="0"/>
-          <w:i w:val="0"/>
-          <w:color w:val="171B23"/>
-          <w:sz w:val="22"/>
-        </w:rPr>
-        <w:t>Este ejemplo puede pasar directamente por la vista previa del editor.</w:t>
-      </w:r>
-    </w:p>
-    <w:p>
-      <w:pPr>
-        <w:pStyle w:val="CodeBlock"/>
-      </w:pPr>
-      <w:r>
-        <w:rPr>
-          <w:rFonts w:ascii="Courier New" w:hAnsi="Courier New"/>
-          <w:b w:val="0"/>
-          <w:i w:val="0"/>
-          <w:color w:val="171B23"/>
-          <w:sz w:val="17"/>
-        </w:rPr>
-        <w:t>TÍTULO: La primera misión de nuestro equipo CanSat</w:t>
-      </w:r>
-      <w:r>
-        <w:br/>
-      </w:r>
-      <w:r>
-        <w:rPr>
-          <w:rFonts w:ascii="Courier New" w:hAnsi="Courier New"/>
-          <w:b w:val="0"/>
-          <w:i w:val="0"/>
-          <w:color w:val="171B23"/>
-          <w:sz w:val="17"/>
-        </w:rPr>
-        <w:t>AUTOR: Andrea Pérez López</w:t>
-      </w:r>
-      <w:r>
-        <w:br/>
-      </w:r>
-      <w:r>
-        <w:rPr>
-          <w:rFonts w:ascii="Courier New" w:hAnsi="Courier New"/>
-          <w:b w:val="0"/>
-          <w:i w:val="0"/>
-          <w:color w:val="171B23"/>
-          <w:sz w:val="17"/>
-        </w:rPr>
-        <w:t>CATEGORÍA: Ingeniería</w:t>
-      </w:r>
-      <w:r>
-        <w:br/>
-      </w:r>
-      <w:r>
-        <w:rPr>
-          <w:rFonts w:ascii="Courier New" w:hAnsi="Courier New"/>
-          <w:b w:val="0"/>
-          <w:i w:val="0"/>
-          <w:color w:val="171B23"/>
-          <w:sz w:val="17"/>
-        </w:rPr>
-        <w:t>BAJADA: Diseñar un satélite del tamaño de una lata nos enseñó a convertir límites reales en decisiones de ingeniería.</w:t>
-      </w:r>
-      <w:r>
-        <w:br/>
-      </w:r>
-      <w:r>
-        <w:rPr>
-          <w:rFonts w:ascii="Courier New" w:hAnsi="Courier New"/>
-          <w:b w:val="0"/>
-          <w:i w:val="0"/>
-          <w:color w:val="171B23"/>
-          <w:sz w:val="17"/>
-        </w:rPr>
-        <w:t>EDICIÓN: julio-2026</w:t>
+        <w:t>TIEMPO DE LECTURA: 8</w:t>
       </w:r>
       <w:r>
         <w:br/>
@@ -1287,7 +1207,30 @@
           <w:color w:val="171B23"/>
           <w:sz w:val="17"/>
         </w:rPr>
-        <w:t>## Una misión pequeña con preguntas grandes</w:t>
+        <w:t>## Aqui empieza el cuerpo</w:t>
+      </w:r>
+    </w:p>
+    <w:p>
+      <w:pPr>
+        <w:pStyle w:val="Heading2"/>
+      </w:pPr>
+      <w:r>
+        <w:t>Senales dentro del texto</w:t>
+      </w:r>
+    </w:p>
+    <w:p>
+      <w:pPr>
+        <w:pStyle w:val="CodeBlock"/>
+      </w:pPr>
+      <w:r>
+        <w:rPr>
+          <w:rFonts w:ascii="Courier New" w:hAnsi="Courier New"/>
+          <w:b w:val="0"/>
+          <w:i w:val="0"/>
+          <w:color w:val="171B23"/>
+          <w:sz w:val="17"/>
+        </w:rPr>
+        <w:t>## Un subtitulo</w:t>
       </w:r>
       <w:r>
         <w:br/>
@@ -1312,7 +1255,312 @@
           <w:color w:val="171B23"/>
           <w:sz w:val="17"/>
         </w:rPr>
-        <w:t>Nuestro equipo comenzó con una pregunta sencilla: ¿cuántos sistemas podíamos integrar dentro del volumen de una lata sin perder confiabilidad?</w:t>
+        <w:t>&gt; Una cita destacada</w:t>
+      </w:r>
+    </w:p>
+    <w:p>
+      <w:pPr>
+        <w:pStyle w:val="ListBullet"/>
+      </w:pPr>
+      <w:r>
+        <w:rPr>
+          <w:rFonts w:ascii="Calibri" w:hAnsi="Calibri"/>
+          <w:b w:val="0"/>
+          <w:i w:val="0"/>
+          <w:color w:val="171B23"/>
+          <w:sz w:val="22"/>
+        </w:rPr>
+        <w:t>Dos signos ## convierten esa linea en subtitulo.</w:t>
+      </w:r>
+    </w:p>
+    <w:p>
+      <w:pPr>
+        <w:pStyle w:val="ListBullet"/>
+      </w:pPr>
+      <w:r>
+        <w:rPr>
+          <w:rFonts w:ascii="Calibri" w:hAnsi="Calibri"/>
+          <w:b w:val="0"/>
+          <w:i w:val="0"/>
+          <w:color w:val="171B23"/>
+          <w:sz w:val="22"/>
+        </w:rPr>
+        <w:t>El signo &gt; al inicio convierte la frase en una cita destacada.</w:t>
+      </w:r>
+    </w:p>
+    <w:p>
+      <w:pPr>
+        <w:pStyle w:val="ListBullet"/>
+      </w:pPr>
+      <w:r>
+        <w:rPr>
+          <w:rFonts w:ascii="Calibri" w:hAnsi="Calibri"/>
+          <w:b w:val="0"/>
+          <w:i w:val="0"/>
+          <w:color w:val="171B23"/>
+          <w:sz w:val="22"/>
+        </w:rPr>
+        <w:t>Deja una linea vacia entre parrafos para que el texto sea facil de revisar.</w:t>
+      </w:r>
+    </w:p>
+    <w:p>
+      <w:pPr>
+        <w:pStyle w:val="Heading2"/>
+      </w:pPr>
+      <w:r>
+        <w:t>Imagenes y pies de foto</w:t>
+      </w:r>
+    </w:p>
+    <w:p>
+      <w:pPr>
+        <w:spacing w:before="0" w:after="120" w:line="300" w:lineRule="auto"/>
+      </w:pPr>
+      <w:r>
+        <w:rPr>
+          <w:rFonts w:ascii="Calibri" w:hAnsi="Calibri"/>
+          <w:b w:val="0"/>
+          <w:i w:val="0"/>
+          <w:color w:val="171B23"/>
+          <w:sz w:val="22"/>
+        </w:rPr>
+        <w:t>Coloca el bloque exactamente en el lugar donde quieres que aparezca la imagen. Cada linea tiene un proposito especifico.</w:t>
+      </w:r>
+    </w:p>
+    <w:p>
+      <w:pPr>
+        <w:pStyle w:val="CodeBlock"/>
+      </w:pPr>
+      <w:r>
+        <w:rPr>
+          <w:rFonts w:ascii="Courier New" w:hAnsi="Courier New"/>
+          <w:b w:val="0"/>
+          <w:i w:val="0"/>
+          <w:color w:val="171B23"/>
+          <w:sz w:val="17"/>
+        </w:rPr>
+        <w:t>[IMAGEN 1]</w:t>
+      </w:r>
+      <w:r>
+        <w:br/>
+      </w:r>
+      <w:r>
+        <w:rPr>
+          <w:rFonts w:ascii="Courier New" w:hAnsi="Courier New"/>
+          <w:b w:val="0"/>
+          <w:i w:val="0"/>
+          <w:color w:val="171B23"/>
+          <w:sz w:val="17"/>
+        </w:rPr>
+        <w:t>RUTA: foto-del-evento.webp</w:t>
+      </w:r>
+      <w:r>
+        <w:br/>
+      </w:r>
+      <w:r>
+        <w:rPr>
+          <w:rFonts w:ascii="Courier New" w:hAnsi="Courier New"/>
+          <w:b w:val="0"/>
+          <w:i w:val="0"/>
+          <w:color w:val="171B23"/>
+          <w:sz w:val="17"/>
+        </w:rPr>
+        <w:t>PIE DE FOTO: El equipo prepara el CanSat antes del lanzamiento. Foto: Ana Lopez.</w:t>
+      </w:r>
+    </w:p>
+    <w:p>
+      <w:pPr>
+        <w:pStyle w:val="ListBullet"/>
+      </w:pPr>
+      <w:r>
+        <w:rPr>
+          <w:rFonts w:ascii="Calibri" w:hAnsi="Calibri"/>
+          <w:b w:val="0"/>
+          <w:i w:val="0"/>
+          <w:color w:val="171B23"/>
+          <w:sz w:val="22"/>
+        </w:rPr>
+        <w:t>Numera en orden: [IMAGEN 1], [IMAGEN 2], [IMAGEN 3]...</w:t>
+      </w:r>
+    </w:p>
+    <w:p>
+      <w:pPr>
+        <w:pStyle w:val="ListBullet"/>
+      </w:pPr>
+      <w:r>
+        <w:rPr>
+          <w:rFonts w:ascii="Calibri" w:hAnsi="Calibri"/>
+          <w:b w:val="0"/>
+          <w:i w:val="0"/>
+          <w:color w:val="171B23"/>
+          <w:sz w:val="22"/>
+        </w:rPr>
+        <w:t>RUTA debe coincidir exactamente con el nombre del archivo dentro de la carpeta, incluyendo la extension.</w:t>
+      </w:r>
+    </w:p>
+    <w:p>
+      <w:pPr>
+        <w:pStyle w:val="ListBullet"/>
+      </w:pPr>
+      <w:r>
+        <w:rPr>
+          <w:rFonts w:ascii="Calibri" w:hAnsi="Calibri"/>
+          <w:b w:val="0"/>
+          <w:i w:val="0"/>
+          <w:color w:val="171B23"/>
+          <w:sz w:val="22"/>
+        </w:rPr>
+        <w:t>El pie debe explicar que ocurre, identificar personas relevantes y dar credito al autor de la foto.</w:t>
+      </w:r>
+    </w:p>
+    <w:p>
+      <w:pPr>
+        <w:pStyle w:val="ListBullet"/>
+      </w:pPr>
+      <w:r>
+        <w:rPr>
+          <w:rFonts w:ascii="Calibri" w:hAnsi="Calibri"/>
+          <w:b w:val="0"/>
+          <w:i w:val="0"/>
+          <w:color w:val="171B23"/>
+          <w:sz w:val="22"/>
+        </w:rPr>
+        <w:t>Envia JPG, PNG o WebP en la mayor resolucion disponible. No pegues capturas dentro del documento de texto.</w:t>
+      </w:r>
+    </w:p>
+    <w:p>
+      <w:r>
+        <w:br w:type="page"/>
+      </w:r>
+    </w:p>
+    <w:p>
+      <w:pPr>
+        <w:pStyle w:val="Heading1"/>
+      </w:pPr>
+      <w:r>
+        <w:t>4. Ejemplo completo</w:t>
+      </w:r>
+    </w:p>
+    <w:p>
+      <w:pPr>
+        <w:spacing w:before="0" w:after="120" w:line="300" w:lineRule="auto"/>
+      </w:pPr>
+      <w:r>
+        <w:rPr>
+          <w:rFonts w:ascii="Calibri" w:hAnsi="Calibri"/>
+          <w:b w:val="0"/>
+          <w:i w:val="0"/>
+          <w:color w:val="171B23"/>
+          <w:sz w:val="22"/>
+        </w:rPr>
+        <w:t>Este archivo listo para publicar puede copiarse y adaptarse para una entrega real.</w:t>
+      </w:r>
+    </w:p>
+    <w:p>
+      <w:pPr>
+        <w:spacing w:before="0" w:after="60" w:line="300" w:lineRule="auto"/>
+      </w:pPr>
+      <w:r>
+        <w:rPr>
+          <w:rFonts w:ascii="Calibri" w:hAnsi="Calibri"/>
+          <w:b w:val="0"/>
+          <w:i w:val="0"/>
+          <w:color w:val="506AB8"/>
+          <w:sz w:val="19"/>
+        </w:rPr>
+        <w:t>ARCHIVO COMPLETO: articulo.md</w:t>
+      </w:r>
+    </w:p>
+    <w:p>
+      <w:pPr>
+        <w:pStyle w:val="CodeBlock"/>
+      </w:pPr>
+      <w:r>
+        <w:rPr>
+          <w:rFonts w:ascii="Courier New" w:hAnsi="Courier New"/>
+          <w:b w:val="0"/>
+          <w:i w:val="0"/>
+          <w:color w:val="171B23"/>
+          <w:sz w:val="17"/>
+        </w:rPr>
+        <w:t>TITULO: La primera mision de nuestro equipo CanSat</w:t>
+      </w:r>
+      <w:r>
+        <w:br/>
+      </w:r>
+      <w:r>
+        <w:rPr>
+          <w:rFonts w:ascii="Courier New" w:hAnsi="Courier New"/>
+          <w:b w:val="0"/>
+          <w:i w:val="0"/>
+          <w:color w:val="171B23"/>
+          <w:sz w:val="17"/>
+        </w:rPr>
+        <w:t>AUTOR: Andrea Perez Lopez</w:t>
+      </w:r>
+      <w:r>
+        <w:br/>
+      </w:r>
+      <w:r>
+        <w:rPr>
+          <w:rFonts w:ascii="Courier New" w:hAnsi="Courier New"/>
+          <w:b w:val="0"/>
+          <w:i w:val="0"/>
+          <w:color w:val="171B23"/>
+          <w:sz w:val="17"/>
+        </w:rPr>
+        <w:t>CATEGORIA: Ingenieria</w:t>
+      </w:r>
+      <w:r>
+        <w:br/>
+      </w:r>
+      <w:r>
+        <w:rPr>
+          <w:rFonts w:ascii="Courier New" w:hAnsi="Courier New"/>
+          <w:b w:val="0"/>
+          <w:i w:val="0"/>
+          <w:color w:val="171B23"/>
+          <w:sz w:val="17"/>
+        </w:rPr>
+        <w:t>SUBTITULO: Disenar un satelite del tamano de una lata nos enseno</w:t>
+      </w:r>
+      <w:r>
+        <w:br/>
+      </w:r>
+      <w:r>
+        <w:rPr>
+          <w:rFonts w:ascii="Courier New" w:hAnsi="Courier New"/>
+          <w:b w:val="0"/>
+          <w:i w:val="0"/>
+          <w:color w:val="171B23"/>
+          <w:sz w:val="17"/>
+        </w:rPr>
+        <w:t xml:space="preserve">  a convertir limites reales en decisiones de ingenieria.</w:t>
+      </w:r>
+      <w:r>
+        <w:br/>
+      </w:r>
+      <w:r>
+        <w:rPr>
+          <w:rFonts w:ascii="Courier New" w:hAnsi="Courier New"/>
+          <w:b w:val="0"/>
+          <w:i w:val="0"/>
+          <w:color w:val="171B23"/>
+          <w:sz w:val="17"/>
+        </w:rPr>
+        <w:t>EDICION: julio-2026</w:t>
+      </w:r>
+      <w:r>
+        <w:br/>
+      </w:r>
+      <w:r>
+        <w:rPr>
+          <w:rFonts w:ascii="Courier New" w:hAnsi="Courier New"/>
+          <w:b w:val="0"/>
+          <w:i w:val="0"/>
+          <w:color w:val="171B23"/>
+          <w:sz w:val="17"/>
+        </w:rPr>
+        <w:t>TIEMPO DE LECTURA: 8</w:t>
       </w:r>
       <w:r>
         <w:br/>
@@ -1337,7 +1585,7 @@
           <w:color w:val="171B23"/>
           <w:sz w:val="17"/>
         </w:rPr>
-        <w:t>Durante tres meses diseñamos la alimentación, la telemetría y el sistema de recuperación. Cada prueba dejó datos y una lista clara de cambios.</w:t>
+        <w:t>---</w:t>
       </w:r>
       <w:r>
         <w:br/>
@@ -1362,7 +1610,7 @@
           <w:color w:val="171B23"/>
           <w:sz w:val="17"/>
         </w:rPr>
-        <w:t>&gt; El prototipo mejoró cuando dejamos de ocultar los errores y empezamos a documentarlos.</w:t>
+        <w:t>## Una mision pequena con preguntas grandes</w:t>
       </w:r>
       <w:r>
         <w:br/>
@@ -1387,7 +1635,33 @@
           <w:color w:val="171B23"/>
           <w:sz w:val="17"/>
         </w:rPr>
-        <w:t>## El día del lanzamiento</w:t>
+        <w:t>Nuestro equipo comenzo con una pregunta sencilla: cuantos sistemas</w:t>
+      </w:r>
+      <w:r>
+        <w:br/>
+      </w:r>
+      <w:r>
+        <w:rPr>
+          <w:rFonts w:ascii="Courier New" w:hAnsi="Courier New"/>
+          <w:b w:val="0"/>
+          <w:i w:val="0"/>
+          <w:color w:val="171B23"/>
+          <w:sz w:val="17"/>
+        </w:rPr>
+        <w:t>podiamos integrar dentro del volumen de una lata sin perder</w:t>
+      </w:r>
+      <w:r>
+        <w:br/>
+      </w:r>
+      <w:r>
+        <w:rPr>
+          <w:rFonts w:ascii="Courier New" w:hAnsi="Courier New"/>
+          <w:b w:val="0"/>
+          <w:i w:val="0"/>
+          <w:color w:val="171B23"/>
+          <w:sz w:val="17"/>
+        </w:rPr>
+        <w:t>confiabilidad?</w:t>
       </w:r>
       <w:r>
         <w:br/>
@@ -1412,7 +1686,147 @@
           <w:color w:val="171B23"/>
           <w:sz w:val="17"/>
         </w:rPr>
-        <w:t>La mañana del lanzamiento revisamos conexiones, batería y recepción de datos. El descenso fue estable y recuperamos el CanSat sin daños.</w:t>
+        <w:t>Durante tres meses disenamos la alimentacion, la telemetria y el</w:t>
+      </w:r>
+      <w:r>
+        <w:br/>
+      </w:r>
+      <w:r>
+        <w:rPr>
+          <w:rFonts w:ascii="Courier New" w:hAnsi="Courier New"/>
+          <w:b w:val="0"/>
+          <w:i w:val="0"/>
+          <w:color w:val="171B23"/>
+          <w:sz w:val="17"/>
+        </w:rPr>
+        <w:t>sistema de recuperacion. Cada prueba dejo datos y una lista clara</w:t>
+      </w:r>
+      <w:r>
+        <w:br/>
+      </w:r>
+      <w:r>
+        <w:rPr>
+          <w:rFonts w:ascii="Courier New" w:hAnsi="Courier New"/>
+          <w:b w:val="0"/>
+          <w:i w:val="0"/>
+          <w:color w:val="171B23"/>
+          <w:sz w:val="17"/>
+        </w:rPr>
+        <w:t>de cambios.</w:t>
+      </w:r>
+      <w:r>
+        <w:br/>
+      </w:r>
+      <w:r>
+        <w:rPr>
+          <w:rFonts w:ascii="Courier New" w:hAnsi="Courier New"/>
+          <w:b w:val="0"/>
+          <w:i w:val="0"/>
+          <w:color w:val="171B23"/>
+          <w:sz w:val="17"/>
+        </w:rPr>
+      </w:r>
+      <w:r>
+        <w:br/>
+      </w:r>
+      <w:r>
+        <w:rPr>
+          <w:rFonts w:ascii="Courier New" w:hAnsi="Courier New"/>
+          <w:b w:val="0"/>
+          <w:i w:val="0"/>
+          <w:color w:val="171B23"/>
+          <w:sz w:val="17"/>
+        </w:rPr>
+        <w:t>&gt; El prototipo mejoro cuando dejamos de ocultar los errores y</w:t>
+      </w:r>
+      <w:r>
+        <w:br/>
+      </w:r>
+      <w:r>
+        <w:rPr>
+          <w:rFonts w:ascii="Courier New" w:hAnsi="Courier New"/>
+          <w:b w:val="0"/>
+          <w:i w:val="0"/>
+          <w:color w:val="171B23"/>
+          <w:sz w:val="17"/>
+        </w:rPr>
+        <w:t>empezamos a documentarlos. -- Andrea Perez, responsable de</w:t>
+      </w:r>
+      <w:r>
+        <w:br/>
+      </w:r>
+      <w:r>
+        <w:rPr>
+          <w:rFonts w:ascii="Courier New" w:hAnsi="Courier New"/>
+          <w:b w:val="0"/>
+          <w:i w:val="0"/>
+          <w:color w:val="171B23"/>
+          <w:sz w:val="17"/>
+        </w:rPr>
+        <w:t>telemetria.</w:t>
+      </w:r>
+      <w:r>
+        <w:br/>
+      </w:r>
+      <w:r>
+        <w:rPr>
+          <w:rFonts w:ascii="Courier New" w:hAnsi="Courier New"/>
+          <w:b w:val="0"/>
+          <w:i w:val="0"/>
+          <w:color w:val="171B23"/>
+          <w:sz w:val="17"/>
+        </w:rPr>
+      </w:r>
+      <w:r>
+        <w:br/>
+      </w:r>
+      <w:r>
+        <w:rPr>
+          <w:rFonts w:ascii="Courier New" w:hAnsi="Courier New"/>
+          <w:b w:val="0"/>
+          <w:i w:val="0"/>
+          <w:color w:val="171B23"/>
+          <w:sz w:val="17"/>
+        </w:rPr>
+        <w:t>## El dia del lanzamiento</w:t>
+      </w:r>
+      <w:r>
+        <w:br/>
+      </w:r>
+      <w:r>
+        <w:rPr>
+          <w:rFonts w:ascii="Courier New" w:hAnsi="Courier New"/>
+          <w:b w:val="0"/>
+          <w:i w:val="0"/>
+          <w:color w:val="171B23"/>
+          <w:sz w:val="17"/>
+        </w:rPr>
+      </w:r>
+      <w:r>
+        <w:br/>
+      </w:r>
+      <w:r>
+        <w:rPr>
+          <w:rFonts w:ascii="Courier New" w:hAnsi="Courier New"/>
+          <w:b w:val="0"/>
+          <w:i w:val="0"/>
+          <w:color w:val="171B23"/>
+          <w:sz w:val="17"/>
+        </w:rPr>
+        <w:t>La manana del lanzamiento revisamos conexiones, bateria y recepcion</w:t>
+      </w:r>
+      <w:r>
+        <w:br/>
+      </w:r>
+      <w:r>
+        <w:rPr>
+          <w:rFonts w:ascii="Courier New" w:hAnsi="Courier New"/>
+          <w:b w:val="0"/>
+          <w:i w:val="0"/>
+          <w:color w:val="171B23"/>
+          <w:sz w:val="17"/>
+        </w:rPr>
+        <w:t>de datos. El descenso fue estable y recuperamos el CanSat sin danos.</w:t>
       </w:r>
       <w:r>
         <w:br/>
@@ -1463,7 +1877,20 @@
           <w:color w:val="171B23"/>
           <w:sz w:val="17"/>
         </w:rPr>
-        <w:t>PIE DE FOTO: El equipo verifica la telemetría minutos antes del lanzamiento. Foto: Andrea Pérez.</w:t>
+        <w:t>PIE DE FOTO: El equipo verifica la telemetria minutos antes del</w:t>
+      </w:r>
+      <w:r>
+        <w:br/>
+      </w:r>
+      <w:r>
+        <w:rPr>
+          <w:rFonts w:ascii="Courier New" w:hAnsi="Courier New"/>
+          <w:b w:val="0"/>
+          <w:i w:val="0"/>
+          <w:color w:val="171B23"/>
+          <w:sz w:val="17"/>
+        </w:rPr>
+        <w:t xml:space="preserve">  lanzamiento. Foto: Andrea Perez.</w:t>
       </w:r>
       <w:r>
         <w:br/>
@@ -1513,7 +1940,63 @@
           <w:color w:val="171B23"/>
           <w:sz w:val="17"/>
         </w:rPr>
-        <w:t>La siguiente versión incorporará un sensor ambiental y una carcasa más ligera. También publicaremos el registro de pruebas para que otros equipos puedan aprender del proceso.</w:t>
+        <w:t>La siguiente version incorporara un sensor ambiental y una carcasa</w:t>
+      </w:r>
+      <w:r>
+        <w:br/>
+      </w:r>
+      <w:r>
+        <w:rPr>
+          <w:rFonts w:ascii="Courier New" w:hAnsi="Courier New"/>
+          <w:b w:val="0"/>
+          <w:i w:val="0"/>
+          <w:color w:val="171B23"/>
+          <w:sz w:val="17"/>
+        </w:rPr>
+        <w:t>mas ligera. Tambien publicaremos el registro de pruebas para que</w:t>
+      </w:r>
+      <w:r>
+        <w:br/>
+      </w:r>
+      <w:r>
+        <w:rPr>
+          <w:rFonts w:ascii="Courier New" w:hAnsi="Courier New"/>
+          <w:b w:val="0"/>
+          <w:i w:val="0"/>
+          <w:color w:val="171B23"/>
+          <w:sz w:val="17"/>
+        </w:rPr>
+        <w:t>otros equipos puedan aprender del proceso.</w:t>
+      </w:r>
+    </w:p>
+    <w:p>
+      <w:pPr>
+        <w:spacing w:before="100" w:after="200" w:line="288" w:lineRule="auto"/>
+        <w:ind w:left="259" w:right="173"/>
+        <w:shd w:fill="E8EEF9"/>
+        <w:pBdr>
+          <w:left w:val="single" w:sz="18" w:space="8" w:color="506AB8"/>
+        </w:pBdr>
+      </w:pPr>
+      <w:r>
+        <w:rPr>
+          <w:rFonts w:ascii="Calibri" w:hAnsi="Calibri"/>
+          <w:b/>
+          <w:i w:val="0"/>
+          <w:color w:val="506AB8"/>
+          <w:sz w:val="19"/>
+        </w:rPr>
+        <w:t xml:space="preserve">LA IDEA  </w:t>
+      </w:r>
+      <w:r>
+        <w:rPr>
+          <w:rFonts w:ascii="Calibri" w:hAnsi="Calibri"/>
+          <w:b w:val="0"/>
+          <w:i w:val="0"/>
+          <w:color w:val="171B23"/>
+          <w:sz w:val="21"/>
+        </w:rPr>
+        <w:t>El texto conserva tu voz. Los encabezados, citas y bloques de imagen solo le indican al editor como convertirlo en una historia legible en el sitio.</w:t>
       </w:r>
     </w:p>
     <w:p>
@@ -1531,7 +2014,7 @@
     </w:p>
     <w:p>
       <w:pPr>
-        <w:pStyle w:val="ListBullet"/>
+        <w:spacing w:before="0" w:after="120" w:line="300" w:lineRule="auto"/>
       </w:pPr>
       <w:r>
         <w:rPr>
@@ -1541,7 +2024,7 @@
           <w:color w:val="171B23"/>
           <w:sz w:val="22"/>
         </w:rPr>
-        <w:t>El archivo incluye TÍTULO, AUTOR y CATEGORÍA.</w:t>
+        <w:t>Esta lista de verificacion te toma dos minutos y evita la mayoria de las correcciones posteriores.</w:t>
       </w:r>
     </w:p>
     <w:p>
@@ -1556,7 +2039,7 @@
           <w:color w:val="171B23"/>
           <w:sz w:val="22"/>
         </w:rPr>
-        <w:t>La línea --- aparece entre los datos y el artículo.</w:t>
+        <w:t>El archivo incluye TITULO, AUTOR y CATEGORIA.</w:t>
       </w:r>
     </w:p>
     <w:p>
@@ -1571,7 +2054,7 @@
           <w:color w:val="171B23"/>
           <w:sz w:val="22"/>
         </w:rPr>
-        <w:t>Los subtítulos comienzan con ##.</w:t>
+        <w:t>El SUBTITULO esta presente (una o dos frases).</w:t>
       </w:r>
     </w:p>
     <w:p>
@@ -1586,7 +2069,67 @@
           <w:color w:val="171B23"/>
           <w:sz w:val="22"/>
         </w:rPr>
-        <w:t>Cada imagen está dentro de la carpeta y tiene un bloque numerado.</w:t>
+        <w:t>TIEMPO DE LECTURA contiene un numero entero de minutos (opcional).</w:t>
+      </w:r>
+    </w:p>
+    <w:p>
+      <w:pPr>
+        <w:pStyle w:val="ListBullet"/>
+      </w:pPr>
+      <w:r>
+        <w:rPr>
+          <w:rFonts w:ascii="Calibri" w:hAnsi="Calibri"/>
+          <w:b w:val="0"/>
+          <w:i w:val="0"/>
+          <w:color w:val="171B23"/>
+          <w:sz w:val="22"/>
+        </w:rPr>
+        <w:t>La linea --- aparece sola entre los metadatos y el cuerpo.</w:t>
+      </w:r>
+    </w:p>
+    <w:p>
+      <w:pPr>
+        <w:pStyle w:val="ListBullet"/>
+      </w:pPr>
+      <w:r>
+        <w:rPr>
+          <w:rFonts w:ascii="Calibri" w:hAnsi="Calibri"/>
+          <w:b w:val="0"/>
+          <w:i w:val="0"/>
+          <w:color w:val="171B23"/>
+          <w:sz w:val="22"/>
+        </w:rPr>
+        <w:t>Los subtitulos comienzan con ##.</w:t>
+      </w:r>
+    </w:p>
+    <w:p>
+      <w:pPr>
+        <w:pStyle w:val="ListBullet"/>
+      </w:pPr>
+      <w:r>
+        <w:rPr>
+          <w:rFonts w:ascii="Calibri" w:hAnsi="Calibri"/>
+          <w:b w:val="0"/>
+          <w:i w:val="0"/>
+          <w:color w:val="171B23"/>
+          <w:sz w:val="22"/>
+        </w:rPr>
+        <w:t>Las citas comienzan con &gt; e incluyen atribucion cuando corresponde.</w:t>
+      </w:r>
+    </w:p>
+    <w:p>
+      <w:pPr>
+        <w:pStyle w:val="ListBullet"/>
+      </w:pPr>
+      <w:r>
+        <w:rPr>
+          <w:rFonts w:ascii="Calibri" w:hAnsi="Calibri"/>
+          <w:b w:val="0"/>
+          <w:i w:val="0"/>
+          <w:color w:val="171B23"/>
+          <w:sz w:val="22"/>
+        </w:rPr>
+        <w:t>Cada imagen esta dentro de la carpeta y tiene un bloque [IMAGEN N].</w:t>
       </w:r>
     </w:p>
     <w:p>
@@ -1616,7 +2159,7 @@
           <w:color w:val="171B23"/>
           <w:sz w:val="22"/>
         </w:rPr>
-        <w:t>Cada imagen tiene PIE DE FOTO y crédito cuando corresponde.</w:t>
+        <w:t>Cada imagen tiene PIE DE FOTO y credito del autor.</w:t>
       </w:r>
     </w:p>
     <w:p>
@@ -1631,7 +2174,7 @@
           <w:color w:val="171B23"/>
           <w:sz w:val="22"/>
         </w:rPr>
-        <w:t>Revisaste ortografía, nombres propios, cifras y enlaces.</w:t>
+        <w:t>Revisaste ortografia, nombres propios, cifras y fuentes.</w:t>
       </w:r>
     </w:p>
     <w:p>
@@ -1646,7 +2189,7 @@
           <w:color w:val="171B23"/>
           <w:sz w:val="22"/>
         </w:rPr>
-        <w:t>La carpeta abre correctamente después de comprimirla como .zip.</w:t>
+        <w:t>La carpeta abre correctamente despues de comprimirla como .zip.</w:t>
       </w:r>
     </w:p>
     <w:p>
@@ -1654,7 +2197,7 @@
         <w:pStyle w:val="Heading1"/>
       </w:pPr>
       <w:r>
-        <w:t>Cómo enviar la carpeta</w:t>
+        <w:t>Como enviar la carpeta</w:t>
       </w:r>
     </w:p>
     <w:p>
@@ -1673,7 +2216,7 @@
           <w:color w:val="171B23"/>
           <w:sz w:val="22"/>
         </w:rPr>
-        <w:t xml:space="preserve">Comprímela. </w:t>
+        <w:t xml:space="preserve">Comprimela. </w:t>
       </w:r>
       <w:r>
         <w:rPr>
@@ -1683,7 +2226,7 @@
           <w:color w:val="171B23"/>
           <w:sz w:val="22"/>
         </w:rPr>
-        <w:t>En Windows: clic derecho sobre la carpeta &gt; Comprimir en archivo ZIP. En macOS: clic derecho &gt; Comprimir.</w:t>
+        <w:t>En Windows: clic derecho sobre la carpeta &gt; Enviar a &gt; Carpeta comprimida (en ZIP). En macOS: clic derecho &gt; Comprimir.</w:t>
       </w:r>
     </w:p>
     <w:p>
@@ -1712,7 +2255,7 @@
           <w:color w:val="171B23"/>
           <w:sz w:val="22"/>
         </w:rPr>
-        <w:t>Usa tu apellido y un título corto, por ejemplo: perez-mision-cansat.zip.</w:t>
+        <w:t>Usa tu apellido y un titulo corto, por ejemplo: perez-mision-cansat.zip.</w:t>
       </w:r>
     </w:p>
     <w:p>
@@ -1731,7 +2274,7 @@
           <w:color w:val="171B23"/>
           <w:sz w:val="22"/>
         </w:rPr>
-        <w:t xml:space="preserve">Envíalo. </w:t>
+        <w:t xml:space="preserve">Enviolo. </w:t>
       </w:r>
       <w:r>
         <w:rPr>
@@ -1741,16 +2284,16 @@
           <w:color w:val="171B23"/>
           <w:sz w:val="22"/>
         </w:rPr>
-        <w:t>Adjunta el ZIP por el medio acordado con el responsable editorial y escribe tu nombre y título en el mensaje.</w:t>
+        <w:t>Adjunta el ZIP por el medio acordado con el responsable editorial e incluye tu nombre y el titulo del articulo en el mensaje.</w:t>
       </w:r>
     </w:p>
     <w:p>
       <w:pPr>
         <w:spacing w:before="100" w:after="200" w:line="288" w:lineRule="auto"/>
         <w:ind w:left="259" w:right="173"/>
-        <w:shd w:fill="E8EEF9"/>
+        <w:shd w:fill="FCEEEB"/>
         <w:pBdr>
-          <w:left w:val="single" w:sz="18" w:space="8" w:color="506AB8"/>
+          <w:left w:val="single" w:sz="18" w:space="8" w:color="C8463A"/>
         </w:pBdr>
       </w:pPr>
       <w:r>
@@ -1758,7 +2301,7 @@
           <w:rFonts w:ascii="Calibri" w:hAnsi="Calibri"/>
           <w:b/>
           <w:i w:val="0"/>
-          <w:color w:val="506AB8"/>
+          <w:color w:val="C8463A"/>
           <w:sz w:val="19"/>
         </w:rPr>
         <w:t xml:space="preserve">SI EL ARCHIVO PESA DEMASIADO  </w:t>
@@ -1771,7 +2314,7 @@
           <w:color w:val="171B23"/>
           <w:sz w:val="21"/>
         </w:rPr>
-        <w:t>Comparte una carpeta de Drive con permiso de lectura y no muevas ni renombres archivos después de enviar el enlace.</w:t>
+        <w:t>Comparte una carpeta de Drive o similar con permiso de lectura. No muevas ni renombres archivos despues de enviar el enlace.</w:t>
       </w:r>
     </w:p>
     <w:p>
@@ -1794,7 +2337,7 @@
           <w:color w:val="171B23"/>
           <w:sz w:val="22"/>
         </w:rPr>
-        <w:t>No necesitas diseñar la página ni acomodar tamaños para web.</w:t>
+        <w:t>No necesitas disenar la pagina ni acomodar tamanos para web.</w:t>
       </w:r>
     </w:p>
     <w:p>
@@ -1824,7 +2367,7 @@
           <w:color w:val="171B23"/>
           <w:sz w:val="22"/>
         </w:rPr>
-        <w:t>No necesitas convertir las imágenes: envía los originales y el editor resolverá la publicación.</w:t>
+        <w:t>No necesitas convertir las imagenes: envia los originales y el editor resolvera la publicacion.</w:t>
       </w:r>
     </w:p>
     <w:p>
@@ -1839,7 +2382,7 @@
           <w:color w:val="17255B"/>
           <w:sz w:val="22"/>
         </w:rPr>
-        <w:t>¿Tienes dudas?</w:t>
+        <w:t>Tienes dudas?</w:t>
       </w:r>
       <w:r>
         <w:rPr>
@@ -1849,7 +2392,7 @@
           <w:color w:val="17255B"/>
           <w:sz w:val="22"/>
         </w:rPr>
-        <w:t xml:space="preserve"> Pregunta antes de cambiar la plantilla. Una pregunta breve suele ahorrar una ronda de correcciones.</w:t>
+        <w:t xml:space="preserve"> Pregunta antes de cambiar las etiquetas de la plantilla. Una pregunta breve suele ahorrar una ronda completa de correcciones.</w:t>
       </w:r>
     </w:p>
     <w:sectPr>
@@ -1879,7 +2422,7 @@
         <w:color w:val="5F6878"/>
         <w:sz w:val="17"/>
       </w:rPr>
-      <w:t xml:space="preserve">Órbita · Aerospace AAFI     </w:t>
+      <w:t xml:space="preserve">Orbita ? Aerospace AAFI     </w:t>
     </w:r>
     <w:r>
       <w:rPr>
@@ -1914,7 +2457,7 @@
         <w:color w:val="506AB8"/>
         <w:sz w:val="17"/>
       </w:rPr>
-      <w:t>ÓRBITA  ·  GUÍA DE COLABORACIÓN</w:t>
+      <w:t>ORBITA  ?  GUIA DE COLABORACION</w:t>
     </w:r>
   </w:p>
 </w:hdr>

</xml_diff>

<commit_message>
chore: create lean Sites deployment commit
</commit_message>
<xml_diff>
--- a/docs/walkthrough/Guia_entrega_articulos_Orbita.docx
+++ b/docs/walkthrough/Guia_entrega_articulos_Orbita.docx
@@ -14,7 +14,7 @@
           <w:color w:val="C8463A"/>
           <w:sz w:val="20"/>
         </w:rPr>
-        <w:t>GUÍA DE COLABORACIÓN</w:t>
+        <w:t>GUIA DE COLABORACION</w:t>
       </w:r>
     </w:p>
     <w:p>
@@ -22,7 +22,7 @@
         <w:pStyle w:val="Title"/>
       </w:pPr>
       <w:r>
-        <w:t>Cómo entregar tu artículo a Órbita</w:t>
+        <w:t>Como entregar tu articulo a Orbita</w:t>
       </w:r>
     </w:p>
     <w:p>
@@ -30,7 +30,7 @@
         <w:pStyle w:val="Subtitle"/>
       </w:pPr>
       <w:r>
-        <w:t>Una carpeta, una plantilla sencilla y todas tus imágenes listas para publicar.</w:t>
+        <w:t>Una carpeta, una plantilla, una vista previa y el editor publica.</w:t>
       </w:r>
     </w:p>
     <w:p>
@@ -50,7 +50,7 @@
           <w:color w:val="506AB8"/>
           <w:sz w:val="19"/>
         </w:rPr>
-        <w:t xml:space="preserve">LO MÁS IMPORTANTE  </w:t>
+        <w:t xml:space="preserve">LO MAS IMPORTANTE  </w:t>
       </w:r>
       <w:r>
         <w:rPr>
@@ -60,7 +60,7 @@
           <w:color w:val="171B23"/>
           <w:sz w:val="21"/>
         </w:rPr>
-        <w:t>No necesitas saber de páginas web. Entrega una carpeta ordenada; el equipo editorial se encarga de revisar, dar formato y publicar.</w:t>
+        <w:t>No necesitas saber de paginas web ni tener acceso al CMS. Entrega una carpeta ordenada con tus archivos; el equipo editorial revisa, corrige y publica.</w:t>
       </w:r>
     </w:p>
     <w:p>
@@ -97,7 +97,7 @@
           <w:color w:val="171B23"/>
           <w:sz w:val="22"/>
         </w:rPr>
-        <w:t>Ponle un nombre corto relacionado con tu artículo.</w:t>
+        <w:t>Ponle un nombre corto relacionado con tu articulo.</w:t>
       </w:r>
     </w:p>
     <w:p>
@@ -126,7 +126,7 @@
           <w:color w:val="171B23"/>
           <w:sz w:val="22"/>
         </w:rPr>
-        <w:t>Guárdala como articulo.txt o articulo.md dentro de la carpeta.</w:t>
+        <w:t>Guardala como articulo.txt o articulo.md dentro de la carpeta.</w:t>
       </w:r>
     </w:p>
     <w:p>
@@ -155,7 +155,7 @@
           <w:color w:val="171B23"/>
           <w:sz w:val="22"/>
         </w:rPr>
-        <w:t>Completa TÍTULO, AUTOR, CATEGORÍA, BAJADA y, si aplica, EDICIÓN.</w:t>
+        <w:t>Completa TITULO, AUTOR, CATEGORIA, SUBTITULO y TIEMPO DE LECTURA.</w:t>
       </w:r>
     </w:p>
     <w:p>
@@ -174,7 +174,7 @@
           <w:color w:val="171B23"/>
           <w:sz w:val="22"/>
         </w:rPr>
-        <w:t xml:space="preserve">Agrega tus imágenes. </w:t>
+        <w:t xml:space="preserve">Agrega tus imagenes. </w:t>
       </w:r>
       <w:r>
         <w:rPr>
@@ -203,7 +203,7 @@
           <w:color w:val="171B23"/>
           <w:sz w:val="22"/>
         </w:rPr>
-        <w:t xml:space="preserve">Comprime y envía. </w:t>
+        <w:t xml:space="preserve">Comprime y envia. </w:t>
       </w:r>
       <w:r>
         <w:rPr>
@@ -213,7 +213,7 @@
           <w:color w:val="171B23"/>
           <w:sz w:val="22"/>
         </w:rPr>
-        <w:t>Convierte la carpeta en un archivo .zip y mándalo al responsable editorial.</w:t>
+        <w:t>Convierte la carpeta en un archivo .zip y mandalo al responsable editorial.</w:t>
       </w:r>
     </w:p>
     <w:p>
@@ -221,7 +221,7 @@
         <w:pStyle w:val="Heading2"/>
       </w:pPr>
       <w:r>
-        <w:t>Qué hará el editor</w:t>
+        <w:t>Que hara el editor</w:t>
       </w:r>
     </w:p>
     <w:p>
@@ -236,7 +236,7 @@
           <w:color w:val="171B23"/>
           <w:sz w:val="22"/>
         </w:rPr>
-        <w:t>Revisará el texto y abrirá una vista previa antes de publicar.</w:t>
+        <w:t>Revisara el texto y abrira una vista previa antes de publicar.</w:t>
       </w:r>
     </w:p>
     <w:p>
@@ -251,7 +251,7 @@
           <w:color w:val="171B23"/>
           <w:sz w:val="22"/>
         </w:rPr>
-        <w:t>Subirá las imágenes y conservará los pies de foto que escribiste.</w:t>
+        <w:t>Subira las imagenes y conservara los pies de foto que escribiste.</w:t>
       </w:r>
     </w:p>
     <w:p>
@@ -266,7 +266,7 @@
           <w:color w:val="171B23"/>
           <w:sz w:val="22"/>
         </w:rPr>
-        <w:t>Te avisará si falta un dato o si una imagen necesita mayor resolución.</w:t>
+        <w:t>Te avisara si falta un dato o si una imagen necesita mayor resolucion.</w:t>
       </w:r>
     </w:p>
     <w:p>
@@ -281,7 +281,7 @@
           <w:color w:val="5F6878"/>
           <w:sz w:val="20"/>
         </w:rPr>
-        <w:t>Tiempo para preparar la entrega: normalmente 5 a 10 minutos después de terminar el texto.</w:t>
+        <w:t>Tiempo para preparar la entrega: normalmente 5 a 10 minutos despues de terminar el texto.</w:t>
       </w:r>
     </w:p>
     <w:p>
@@ -309,7 +309,7 @@
           <w:color w:val="171B23"/>
           <w:sz w:val="22"/>
         </w:rPr>
-        <w:t>La carpeta evita que se pierdan imágenes, nombres o leyendas. Todo lo necesario para publicar debe quedar dentro.</w:t>
+        <w:t>La carpeta evita que se pierdan imagenes, nombres o leyendas. Todo lo necesario para publicar debe quedar dentro.</w:t>
       </w:r>
     </w:p>
     <w:p>
@@ -352,7 +352,7 @@
           <w:color w:val="171B23"/>
           <w:sz w:val="17"/>
         </w:rPr>
-        <w:t xml:space="preserve">  articulo.txt</w:t>
+        <w:t xml:space="preserve">  articulo.md</w:t>
       </w:r>
       <w:r>
         <w:br/>
@@ -408,7 +408,92 @@
           <w:color w:val="171B23"/>
           <w:sz w:val="21"/>
         </w:rPr>
-        <w:t>Usa letras, números y guiones. Evita nombres como IMG_0042 final FINAL.jpg. Prefiere foto-del-evento.jpg.</w:t>
+        <w:t>Solo caracteres seguros: letras sin acento, numeros y guiones. Nada de espacios, enies, signos de puntuacion ni caracteres especiales.</w:t>
+      </w:r>
+    </w:p>
+    <w:p>
+      <w:pPr>
+        <w:pStyle w:val="ListBullet"/>
+      </w:pPr>
+      <w:r>
+        <w:rPr>
+          <w:rFonts w:ascii="Calibri" w:hAnsi="Calibri"/>
+          <w:b w:val="0"/>
+          <w:i w:val="0"/>
+          <w:color w:val="171B23"/>
+          <w:sz w:val="22"/>
+        </w:rPr>
+        <w:t>Un solo archivo de texto por articulo (articulo.md o articulo.txt).</w:t>
+      </w:r>
+    </w:p>
+    <w:p>
+      <w:pPr>
+        <w:pStyle w:val="ListBullet"/>
+      </w:pPr>
+      <w:r>
+        <w:rPr>
+          <w:rFonts w:ascii="Calibri" w:hAnsi="Calibri"/>
+          <w:b w:val="0"/>
+          <w:i w:val="0"/>
+          <w:color w:val="171B23"/>
+          <w:sz w:val="22"/>
+        </w:rPr>
+        <w:t>Imagenes en JPG, PNG o WebP. Hasta 10 MB cada una.</w:t>
+      </w:r>
+    </w:p>
+    <w:p>
+      <w:pPr>
+        <w:pStyle w:val="ListBullet"/>
+      </w:pPr>
+      <w:r>
+        <w:rPr>
+          <w:rFonts w:ascii="Calibri" w:hAnsi="Calibri"/>
+          <w:b w:val="0"/>
+          <w:i w:val="0"/>
+          <w:color w:val="171B23"/>
+          <w:sz w:val="22"/>
+        </w:rPr>
+        <w:t>Todos los archivos dentro de la misma carpeta, sin subcarpetas complejas.</w:t>
+      </w:r>
+    </w:p>
+    <w:p>
+      <w:pPr>
+        <w:pStyle w:val="ListBullet"/>
+      </w:pPr>
+      <w:r>
+        <w:rPr>
+          <w:rFonts w:ascii="Calibri" w:hAnsi="Calibri"/>
+          <w:b/>
+          <w:i w:val="0"/>
+          <w:color w:val="171B23"/>
+          <w:sz w:val="22"/>
+        </w:rPr>
+        <w:t xml:space="preserve">Nombres de archivo: </w:t>
+      </w:r>
+      <w:r>
+        <w:rPr>
+          <w:rFonts w:ascii="Calibri" w:hAnsi="Calibri"/>
+          <w:b w:val="0"/>
+          <w:i w:val="0"/>
+          <w:color w:val="171B23"/>
+          <w:sz w:val="22"/>
+        </w:rPr>
+        <w:t>solo a-z, 0-9 y guiones. Nada de espacios, acentos, enies, signos de puntuacion ni caracteres especiales. Ejemplo bueno: equipo-lanzamiento.jpg. Ejemplo malo: IMG_0042 final FINAL.jpg (tiene espacios).</w:t>
+      </w:r>
+    </w:p>
+    <w:p>
+      <w:pPr>
+        <w:pStyle w:val="ListBullet"/>
+      </w:pPr>
+      <w:r>
+        <w:rPr>
+          <w:rFonts w:ascii="Calibri" w:hAnsi="Calibri"/>
+          <w:b w:val="0"/>
+          <w:i w:val="0"/>
+          <w:color w:val="171B23"/>
+          <w:sz w:val="22"/>
+        </w:rPr>
+        <w:t>El nombre en RUTA debe coincidir exactamente con el archivo dentro de la carpeta, incluyendo la extension.</w:t>
       </w:r>
     </w:p>
     <w:p>
@@ -417,6 +502,36 @@
       </w:pPr>
       <w:r>
         <w:t>2. Copia esta plantilla</w:t>
+      </w:r>
+    </w:p>
+    <w:p>
+      <w:pPr>
+        <w:spacing w:before="0" w:after="120" w:line="300" w:lineRule="auto"/>
+      </w:pPr>
+      <w:r>
+        <w:rPr>
+          <w:rFonts w:ascii="Calibri" w:hAnsi="Calibri"/>
+          <w:b w:val="0"/>
+          <w:i w:val="0"/>
+          <w:color w:val="171B23"/>
+          <w:sz w:val="22"/>
+        </w:rPr>
+        <w:t>Completa los campos de la parte superior y escribe el cuerpo debajo del separador ---. No borres ni modifiques los nombres de los campos.</w:t>
+      </w:r>
+    </w:p>
+    <w:p>
+      <w:pPr>
+        <w:spacing w:before="0" w:after="60" w:line="300" w:lineRule="auto"/>
+      </w:pPr>
+      <w:r>
+        <w:rPr>
+          <w:rFonts w:ascii="Calibri" w:hAnsi="Calibri"/>
+          <w:b w:val="0"/>
+          <w:i w:val="0"/>
+          <w:color w:val="506AB8"/>
+          <w:sz w:val="19"/>
+        </w:rPr>
+        <w:t>PLANTILLA COMPLETA -- COPIA ESTE BLOQUE</w:t>
       </w:r>
     </w:p>
     <w:p>
@@ -431,7 +546,7 @@
           <w:color w:val="171B23"/>
           <w:sz w:val="17"/>
         </w:rPr>
-        <w:t>TÍTULO:</w:t>
+        <w:t>TITULO: La primera mision de nuestro equipo CanSat</w:t>
       </w:r>
       <w:r>
         <w:br/>
@@ -444,7 +559,7 @@
           <w:color w:val="171B23"/>
           <w:sz w:val="17"/>
         </w:rPr>
-        <w:t>AUTOR:</w:t>
+        <w:t>AUTOR: Andrea Perez Lopez</w:t>
       </w:r>
       <w:r>
         <w:br/>
@@ -457,7 +572,7 @@
           <w:color w:val="171B23"/>
           <w:sz w:val="17"/>
         </w:rPr>
-        <w:t>CATEGORÍA:</w:t>
+        <w:t>CATEGORIA: Ingenieria</w:t>
       </w:r>
       <w:r>
         <w:br/>
@@ -470,7 +585,7 @@
           <w:color w:val="171B23"/>
           <w:sz w:val="17"/>
         </w:rPr>
-        <w:t>BAJADA:</w:t>
+        <w:t>SUBTITULO: Disenar un satelite del tamano de una lata nos enseno a</w:t>
       </w:r>
       <w:r>
         <w:br/>
@@ -483,7 +598,33 @@
           <w:color w:val="171B23"/>
           <w:sz w:val="17"/>
         </w:rPr>
-        <w:t>EDICIÓN:</w:t>
+        <w:t xml:space="preserve">  convertir limites reales en decisiones de ingenieria.</w:t>
+      </w:r>
+      <w:r>
+        <w:br/>
+      </w:r>
+      <w:r>
+        <w:rPr>
+          <w:rFonts w:ascii="Courier New" w:hAnsi="Courier New"/>
+          <w:b w:val="0"/>
+          <w:i w:val="0"/>
+          <w:color w:val="171B23"/>
+          <w:sz w:val="17"/>
+        </w:rPr>
+        <w:t>EDICION: julio-2026</w:t>
+      </w:r>
+      <w:r>
+        <w:br/>
+      </w:r>
+      <w:r>
+        <w:rPr>
+          <w:rFonts w:ascii="Courier New" w:hAnsi="Courier New"/>
+          <w:b w:val="0"/>
+          <w:i w:val="0"/>
+          <w:color w:val="171B23"/>
+          <w:sz w:val="17"/>
+        </w:rPr>
+        <w:t>TIEMPO DE LECTURA: 8</w:t>
       </w:r>
       <w:r>
         <w:br/>
@@ -533,7 +674,7 @@
           <w:color w:val="171B23"/>
           <w:sz w:val="17"/>
         </w:rPr>
-        <w:t>## Primer subtítulo</w:t>
+        <w:t>## Primer subtitulo</w:t>
       </w:r>
       <w:r>
         <w:br/>
@@ -558,7 +699,7 @@
           <w:color w:val="171B23"/>
           <w:sz w:val="17"/>
         </w:rPr>
-        <w:t>Escribe aquí tu primer párrafo.</w:t>
+        <w:t>Escribe aqui tu primer parrafo. Deja una linea vacia entre parrafos.</w:t>
       </w:r>
       <w:r>
         <w:br/>
@@ -608,7 +749,7 @@
           <w:color w:val="171B23"/>
           <w:sz w:val="17"/>
         </w:rPr>
-        <w:t>## Segundo subtítulo</w:t>
+        <w:t>## Segundo subtitulo</w:t>
       </w:r>
       <w:r>
         <w:br/>
@@ -633,7 +774,7 @@
           <w:color w:val="171B23"/>
           <w:sz w:val="17"/>
         </w:rPr>
-        <w:t>Continúa aquí el artículo.</w:t>
+        <w:t>Continua aqui el articulo.</w:t>
       </w:r>
       <w:r>
         <w:br/>
@@ -671,7 +812,7 @@
           <w:color w:val="171B23"/>
           <w:sz w:val="17"/>
         </w:rPr>
-        <w:t>RUTA: nombre-exacto-de-la-imagen.jpg</w:t>
+        <w:t>RUTA: foto-del-evento.webp</w:t>
       </w:r>
       <w:r>
         <w:br/>
@@ -684,7 +825,20 @@
           <w:color w:val="171B23"/>
           <w:sz w:val="17"/>
         </w:rPr>
-        <w:t>PIE DE FOTO: Explica qué aparece, dónde y quién tomó la foto.</w:t>
+        <w:t>PIE DE FOTO: Explica que aparece, donde ocurre, quien participa y quien</w:t>
+      </w:r>
+      <w:r>
+        <w:br/>
+      </w:r>
+      <w:r>
+        <w:rPr>
+          <w:rFonts w:ascii="Courier New" w:hAnsi="Courier New"/>
+          <w:b w:val="0"/>
+          <w:i w:val="0"/>
+          <w:color w:val="171B23"/>
+          <w:sz w:val="17"/>
+        </w:rPr>
+        <w:t xml:space="preserve">  tomo la foto.</w:t>
       </w:r>
       <w:r>
         <w:br/>
@@ -709,7 +863,7 @@
           <w:color w:val="171B23"/>
           <w:sz w:val="17"/>
         </w:rPr>
-        <w:t>## Conclusión</w:t>
+        <w:t>## Conclusion</w:t>
       </w:r>
       <w:r>
         <w:br/>
@@ -739,167 +893,6 @@
     </w:p>
     <w:p>
       <w:pPr>
-        <w:spacing w:before="0" w:after="120" w:line="300" w:lineRule="auto"/>
-      </w:pPr>
-      <w:r>
-        <w:rPr>
-          <w:rFonts w:ascii="Calibri" w:hAnsi="Calibri"/>
-          <w:b w:val="0"/>
-          <w:i/>
-          <w:color w:val="5F6878"/>
-          <w:sz w:val="20"/>
-        </w:rPr>
-        <w:t>Guarda el archivo como articulo.txt o articulo.md. No hace falta cambiar tipografías, colores ni márgenes.</w:t>
-      </w:r>
-    </w:p>
-    <w:p>
-      <w:r>
-        <w:br w:type="page"/>
-      </w:r>
-    </w:p>
-    <w:p>
-      <w:pPr>
-        <w:pStyle w:val="Heading1"/>
-      </w:pPr>
-      <w:r>
-        <w:t>3. Escribe el artículo</w:t>
-      </w:r>
-    </w:p>
-    <w:p>
-      <w:pPr>
-        <w:pStyle w:val="Heading2"/>
-      </w:pPr>
-      <w:r>
-        <w:t>Datos de la parte superior</w:t>
-      </w:r>
-    </w:p>
-    <w:p>
-      <w:pPr>
-        <w:pStyle w:val="ListBullet"/>
-      </w:pPr>
-      <w:r>
-        <w:rPr>
-          <w:rFonts w:ascii="Calibri" w:hAnsi="Calibri"/>
-          <w:b/>
-          <w:i w:val="0"/>
-          <w:color w:val="171B23"/>
-          <w:sz w:val="22"/>
-        </w:rPr>
-        <w:t>TÍTULO:</w:t>
-      </w:r>
-      <w:r>
-        <w:rPr>
-          <w:rFonts w:ascii="Calibri" w:hAnsi="Calibri"/>
-          <w:b w:val="0"/>
-          <w:i w:val="0"/>
-          <w:color w:val="171B23"/>
-          <w:sz w:val="22"/>
-        </w:rPr>
-        <w:t xml:space="preserve"> obligatorio. Usa el título que quieres que vea el lector.</w:t>
-      </w:r>
-    </w:p>
-    <w:p>
-      <w:pPr>
-        <w:pStyle w:val="ListBullet"/>
-      </w:pPr>
-      <w:r>
-        <w:rPr>
-          <w:rFonts w:ascii="Calibri" w:hAnsi="Calibri"/>
-          <w:b/>
-          <w:i w:val="0"/>
-          <w:color w:val="171B23"/>
-          <w:sz w:val="22"/>
-        </w:rPr>
-        <w:t>AUTOR:</w:t>
-      </w:r>
-      <w:r>
-        <w:rPr>
-          <w:rFonts w:ascii="Calibri" w:hAnsi="Calibri"/>
-          <w:b w:val="0"/>
-          <w:i w:val="0"/>
-          <w:color w:val="171B23"/>
-          <w:sz w:val="22"/>
-        </w:rPr>
-        <w:t xml:space="preserve"> obligatorio. Escribe tu nombre completo.</w:t>
-      </w:r>
-    </w:p>
-    <w:p>
-      <w:pPr>
-        <w:pStyle w:val="ListBullet"/>
-      </w:pPr>
-      <w:r>
-        <w:rPr>
-          <w:rFonts w:ascii="Calibri" w:hAnsi="Calibri"/>
-          <w:b/>
-          <w:i w:val="0"/>
-          <w:color w:val="171B23"/>
-          <w:sz w:val="22"/>
-        </w:rPr>
-        <w:t>CATEGORÍA:</w:t>
-      </w:r>
-      <w:r>
-        <w:rPr>
-          <w:rFonts w:ascii="Calibri" w:hAnsi="Calibri"/>
-          <w:b w:val="0"/>
-          <w:i w:val="0"/>
-          <w:color w:val="171B23"/>
-          <w:sz w:val="22"/>
-        </w:rPr>
-        <w:t xml:space="preserve"> obligatoria. Ejemplos: Ingeniería, Entrevista, Aeroespacial, Investigación o Comunidad.</w:t>
-      </w:r>
-    </w:p>
-    <w:p>
-      <w:pPr>
-        <w:pStyle w:val="ListBullet"/>
-      </w:pPr>
-      <w:r>
-        <w:rPr>
-          <w:rFonts w:ascii="Calibri" w:hAnsi="Calibri"/>
-          <w:b/>
-          <w:i w:val="0"/>
-          <w:color w:val="171B23"/>
-          <w:sz w:val="22"/>
-        </w:rPr>
-        <w:t>BAJADA:</w:t>
-      </w:r>
-      <w:r>
-        <w:rPr>
-          <w:rFonts w:ascii="Calibri" w:hAnsi="Calibri"/>
-          <w:b w:val="0"/>
-          <w:i w:val="0"/>
-          <w:color w:val="171B23"/>
-          <w:sz w:val="22"/>
-        </w:rPr>
-        <w:t xml:space="preserve"> una o dos frases que resumen la historia y despiertan interés.</w:t>
-      </w:r>
-    </w:p>
-    <w:p>
-      <w:pPr>
-        <w:pStyle w:val="ListBullet"/>
-      </w:pPr>
-      <w:r>
-        <w:rPr>
-          <w:rFonts w:ascii="Calibri" w:hAnsi="Calibri"/>
-          <w:b/>
-          <w:i w:val="0"/>
-          <w:color w:val="171B23"/>
-          <w:sz w:val="22"/>
-        </w:rPr>
-        <w:t>EDICIÓN:</w:t>
-      </w:r>
-      <w:r>
-        <w:rPr>
-          <w:rFonts w:ascii="Calibri" w:hAnsi="Calibri"/>
-          <w:b w:val="0"/>
-          <w:i w:val="0"/>
-          <w:color w:val="171B23"/>
-          <w:sz w:val="22"/>
-        </w:rPr>
-        <w:t xml:space="preserve"> opcional. Déjala vacía si el editor no te indicó una edición.</w:t>
-      </w:r>
-    </w:p>
-    <w:p>
-      <w:pPr>
         <w:spacing w:before="100" w:after="200" w:line="288" w:lineRule="auto"/>
         <w:ind w:left="259" w:right="173"/>
         <w:shd w:fill="FCEEEB"/>
@@ -915,7 +908,7 @@
           <w:color w:val="C8463A"/>
           <w:sz w:val="19"/>
         </w:rPr>
-        <w:t xml:space="preserve">NO BORRES ESTA LÍNEA  </w:t>
+        <w:t xml:space="preserve">IMPORTANTE  </w:t>
       </w:r>
       <w:r>
         <w:rPr>
@@ -925,7 +918,20 @@
           <w:color w:val="171B23"/>
           <w:sz w:val="21"/>
         </w:rPr>
-        <w:t>El separador --- debe ir solo en una línea entre los datos y el cuerpo del artículo.</w:t>
+        <w:t>Usa SUBTITULO, no BAJADA. TIEMPO DE LECTURA debe ser un numero entero entre 1 y 90 minutos. El editor podra ajustarlo.</w:t>
+      </w:r>
+    </w:p>
+    <w:p>
+      <w:r>
+        <w:br w:type="page"/>
+      </w:r>
+    </w:p>
+    <w:p>
+      <w:pPr>
+        <w:pStyle w:val="Heading1"/>
+      </w:pPr>
+      <w:r>
+        <w:t>3. Escribe el articulo</w:t>
       </w:r>
     </w:p>
     <w:p>
@@ -933,7 +939,210 @@
         <w:pStyle w:val="Heading2"/>
       </w:pPr>
       <w:r>
-        <w:t>Señales sencillas dentro del texto</w:t>
+        <w:t>Campos obligatorios y opcionales</w:t>
+      </w:r>
+    </w:p>
+    <w:p>
+      <w:pPr>
+        <w:pStyle w:val="ListBullet"/>
+      </w:pPr>
+      <w:r>
+        <w:rPr>
+          <w:rFonts w:ascii="Calibri" w:hAnsi="Calibri"/>
+          <w:b/>
+          <w:i w:val="0"/>
+          <w:color w:val="171B23"/>
+          <w:sz w:val="22"/>
+        </w:rPr>
+        <w:t xml:space="preserve">TITULO: </w:t>
+      </w:r>
+      <w:r>
+        <w:rPr>
+          <w:rFonts w:ascii="Calibri" w:hAnsi="Calibri"/>
+          <w:b w:val="0"/>
+          <w:i w:val="0"/>
+          <w:color w:val="171B23"/>
+          <w:sz w:val="22"/>
+        </w:rPr>
+        <w:t>obligatorio. El titulo que veran los lectores.</w:t>
+      </w:r>
+    </w:p>
+    <w:p>
+      <w:pPr>
+        <w:pStyle w:val="ListBullet"/>
+      </w:pPr>
+      <w:r>
+        <w:rPr>
+          <w:rFonts w:ascii="Calibri" w:hAnsi="Calibri"/>
+          <w:b/>
+          <w:i w:val="0"/>
+          <w:color w:val="171B23"/>
+          <w:sz w:val="22"/>
+        </w:rPr>
+        <w:t xml:space="preserve">AUTOR: </w:t>
+      </w:r>
+      <w:r>
+        <w:rPr>
+          <w:rFonts w:ascii="Calibri" w:hAnsi="Calibri"/>
+          <w:b w:val="0"/>
+          <w:i w:val="0"/>
+          <w:color w:val="171B23"/>
+          <w:sz w:val="22"/>
+        </w:rPr>
+        <w:t>obligatorio. Tu nombre completo.</w:t>
+      </w:r>
+    </w:p>
+    <w:p>
+      <w:pPr>
+        <w:pStyle w:val="ListBullet"/>
+      </w:pPr>
+      <w:r>
+        <w:rPr>
+          <w:rFonts w:ascii="Calibri" w:hAnsi="Calibri"/>
+          <w:b/>
+          <w:i w:val="0"/>
+          <w:color w:val="171B23"/>
+          <w:sz w:val="22"/>
+        </w:rPr>
+        <w:t xml:space="preserve">CATEGORIA: </w:t>
+      </w:r>
+      <w:r>
+        <w:rPr>
+          <w:rFonts w:ascii="Calibri" w:hAnsi="Calibri"/>
+          <w:b w:val="0"/>
+          <w:i w:val="0"/>
+          <w:color w:val="171B23"/>
+          <w:sz w:val="22"/>
+        </w:rPr>
+        <w:t>obligatoria. Ejemplos: Ingenieria, Entrevista, Aeroespacial, Investigacion o Comunidad.</w:t>
+      </w:r>
+    </w:p>
+    <w:p>
+      <w:pPr>
+        <w:pStyle w:val="ListBullet"/>
+      </w:pPr>
+      <w:r>
+        <w:rPr>
+          <w:rFonts w:ascii="Calibri" w:hAnsi="Calibri"/>
+          <w:b/>
+          <w:i w:val="0"/>
+          <w:color w:val="171B23"/>
+          <w:sz w:val="22"/>
+        </w:rPr>
+        <w:t xml:space="preserve">SUBTITULO: </w:t>
+      </w:r>
+      <w:r>
+        <w:rPr>
+          <w:rFonts w:ascii="Calibri" w:hAnsi="Calibri"/>
+          <w:b w:val="0"/>
+          <w:i w:val="0"/>
+          <w:color w:val="171B23"/>
+          <w:sz w:val="22"/>
+        </w:rPr>
+        <w:t>una o dos frases que resumen la historia y despiertan interes. Tambien se acepta BAJADA si prefieres ese nombre.</w:t>
+      </w:r>
+    </w:p>
+    <w:p>
+      <w:pPr>
+        <w:pStyle w:val="ListBullet"/>
+      </w:pPr>
+      <w:r>
+        <w:rPr>
+          <w:rFonts w:ascii="Calibri" w:hAnsi="Calibri"/>
+          <w:b/>
+          <w:i w:val="0"/>
+          <w:color w:val="171B23"/>
+          <w:sz w:val="22"/>
+        </w:rPr>
+        <w:t xml:space="preserve">EDICION: </w:t>
+      </w:r>
+      <w:r>
+        <w:rPr>
+          <w:rFonts w:ascii="Calibri" w:hAnsi="Calibri"/>
+          <w:b w:val="0"/>
+          <w:i w:val="0"/>
+          <w:color w:val="171B23"/>
+          <w:sz w:val="22"/>
+        </w:rPr>
+        <w:t>opcional. Dejala vacia si el editor no te indico una edicion.</w:t>
+      </w:r>
+    </w:p>
+    <w:p>
+      <w:pPr>
+        <w:pStyle w:val="ListBullet"/>
+      </w:pPr>
+      <w:r>
+        <w:rPr>
+          <w:rFonts w:ascii="Calibri" w:hAnsi="Calibri"/>
+          <w:b/>
+          <w:i w:val="0"/>
+          <w:color w:val="171B23"/>
+          <w:sz w:val="22"/>
+        </w:rPr>
+        <w:t xml:space="preserve">TIEMPO DE LECTURA: </w:t>
+      </w:r>
+      <w:r>
+        <w:rPr>
+          <w:rFonts w:ascii="Calibri" w:hAnsi="Calibri"/>
+          <w:b w:val="0"/>
+          <w:i w:val="0"/>
+          <w:color w:val="171B23"/>
+          <w:sz w:val="22"/>
+        </w:rPr>
+        <w:t>opcional. Un numero entero que indica los minutos estimados. Si no lo pones, el editor lo calculara.</w:t>
+      </w:r>
+    </w:p>
+    <w:p>
+      <w:pPr>
+        <w:spacing w:before="100" w:after="200" w:line="288" w:lineRule="auto"/>
+        <w:ind w:left="259" w:right="173"/>
+        <w:shd w:fill="E8EEF9"/>
+        <w:pBdr>
+          <w:left w:val="single" w:sz="18" w:space="8" w:color="506AB8"/>
+        </w:pBdr>
+      </w:pPr>
+      <w:r>
+        <w:rPr>
+          <w:rFonts w:ascii="Calibri" w:hAnsi="Calibri"/>
+          <w:b/>
+          <w:i w:val="0"/>
+          <w:color w:val="506AB8"/>
+          <w:sz w:val="19"/>
+        </w:rPr>
+        <w:t xml:space="preserve">ESTIMAR EL TIEMPO DE LECTURA  </w:t>
+      </w:r>
+      <w:r>
+        <w:rPr>
+          <w:rFonts w:ascii="Calibri" w:hAnsi="Calibri"/>
+          <w:b w:val="0"/>
+          <w:i w:val="0"/>
+          <w:color w:val="171B23"/>
+          <w:sz w:val="21"/>
+        </w:rPr>
+        <w:t>Cuenta las palabras de tu articulo y divide entre 200. Ejemplo: 1,600 palabras / 200 = 8 minutos. Redondea al entero mas cercano. Escribe solo el numero, sin minutos ni comas.</w:t>
+      </w:r>
+    </w:p>
+    <w:p>
+      <w:pPr>
+        <w:pStyle w:val="Heading2"/>
+      </w:pPr>
+      <w:r>
+        <w:t>El separador ---</w:t>
+      </w:r>
+    </w:p>
+    <w:p>
+      <w:pPr>
+        <w:spacing w:before="0" w:after="120" w:line="300" w:lineRule="auto"/>
+      </w:pPr>
+      <w:r>
+        <w:rPr>
+          <w:rFonts w:ascii="Calibri" w:hAnsi="Calibri"/>
+          <w:b w:val="0"/>
+          <w:i w:val="0"/>
+          <w:color w:val="171B23"/>
+          <w:sz w:val="22"/>
+        </w:rPr>
+        <w:t>La linea --- debe ir sola, en su propia linea, entre los metadatos y el cuerpo del articulo. Si la borras, el sistema no podra procesar el archivo.</w:t>
       </w:r>
     </w:p>
     <w:p>
@@ -948,296 +1157,7 @@
           <w:color w:val="171B23"/>
           <w:sz w:val="17"/>
         </w:rPr>
-        <w:t>## Un subtítulo</w:t>
-      </w:r>
-      <w:r>
-        <w:br/>
-      </w:r>
-      <w:r>
-        <w:rPr>
-          <w:rFonts w:ascii="Courier New" w:hAnsi="Courier New"/>
-          <w:b w:val="0"/>
-          <w:i w:val="0"/>
-          <w:color w:val="171B23"/>
-          <w:sz w:val="17"/>
-        </w:rPr>
-      </w:r>
-      <w:r>
-        <w:br/>
-      </w:r>
-      <w:r>
-        <w:rPr>
-          <w:rFonts w:ascii="Courier New" w:hAnsi="Courier New"/>
-          <w:b w:val="0"/>
-          <w:i w:val="0"/>
-          <w:color w:val="171B23"/>
-          <w:sz w:val="17"/>
-        </w:rPr>
-        <w:t>&gt; Una cita destacada</w:t>
-      </w:r>
-    </w:p>
-    <w:p>
-      <w:pPr>
-        <w:pStyle w:val="ListBullet"/>
-      </w:pPr>
-      <w:r>
-        <w:rPr>
-          <w:rFonts w:ascii="Calibri" w:hAnsi="Calibri"/>
-          <w:b w:val="0"/>
-          <w:i w:val="0"/>
-          <w:color w:val="171B23"/>
-          <w:sz w:val="22"/>
-        </w:rPr>
-        <w:t>Dos signos ## convierten esa línea en subtítulo.</w:t>
-      </w:r>
-    </w:p>
-    <w:p>
-      <w:pPr>
-        <w:pStyle w:val="ListBullet"/>
-      </w:pPr>
-      <w:r>
-        <w:rPr>
-          <w:rFonts w:ascii="Calibri" w:hAnsi="Calibri"/>
-          <w:b w:val="0"/>
-          <w:i w:val="0"/>
-          <w:color w:val="171B23"/>
-          <w:sz w:val="22"/>
-        </w:rPr>
-        <w:t>El signo &gt; al inicio convierte la frase en una cita destacada.</w:t>
-      </w:r>
-    </w:p>
-    <w:p>
-      <w:pPr>
-        <w:pStyle w:val="ListBullet"/>
-      </w:pPr>
-      <w:r>
-        <w:rPr>
-          <w:rFonts w:ascii="Calibri" w:hAnsi="Calibri"/>
-          <w:b w:val="0"/>
-          <w:i w:val="0"/>
-          <w:color w:val="171B23"/>
-          <w:sz w:val="22"/>
-        </w:rPr>
-        <w:t>Deja una línea vacía entre párrafos para que el texto sea fácil de revisar.</w:t>
-      </w:r>
-    </w:p>
-    <w:p>
-      <w:pPr>
-        <w:pStyle w:val="Heading1"/>
-      </w:pPr>
-      <w:r>
-        <w:t>Imágenes y pies de foto</w:t>
-      </w:r>
-    </w:p>
-    <w:p>
-      <w:pPr>
-        <w:spacing w:before="0" w:after="120" w:line="300" w:lineRule="auto"/>
-      </w:pPr>
-      <w:r>
-        <w:rPr>
-          <w:rFonts w:ascii="Calibri" w:hAnsi="Calibri"/>
-          <w:b w:val="0"/>
-          <w:i w:val="0"/>
-          <w:color w:val="171B23"/>
-          <w:sz w:val="22"/>
-        </w:rPr>
-        <w:t>Coloca el bloque exactamente en el lugar donde quieres que aparezca la imagen. Cada dato ocupa una sola línea.</w:t>
-      </w:r>
-    </w:p>
-    <w:p>
-      <w:pPr>
-        <w:pStyle w:val="CodeBlock"/>
-      </w:pPr>
-      <w:r>
-        <w:rPr>
-          <w:rFonts w:ascii="Courier New" w:hAnsi="Courier New"/>
-          <w:b w:val="0"/>
-          <w:i w:val="0"/>
-          <w:color w:val="171B23"/>
-          <w:sz w:val="17"/>
-        </w:rPr>
-        <w:t>[IMAGEN 1]</w:t>
-      </w:r>
-      <w:r>
-        <w:br/>
-      </w:r>
-      <w:r>
-        <w:rPr>
-          <w:rFonts w:ascii="Courier New" w:hAnsi="Courier New"/>
-          <w:b w:val="0"/>
-          <w:i w:val="0"/>
-          <w:color w:val="171B23"/>
-          <w:sz w:val="17"/>
-        </w:rPr>
-        <w:t>RUTA: foto-del-evento.webp</w:t>
-      </w:r>
-      <w:r>
-        <w:br/>
-      </w:r>
-      <w:r>
-        <w:rPr>
-          <w:rFonts w:ascii="Courier New" w:hAnsi="Courier New"/>
-          <w:b w:val="0"/>
-          <w:i w:val="0"/>
-          <w:color w:val="171B23"/>
-          <w:sz w:val="17"/>
-        </w:rPr>
-        <w:t>PIE DE FOTO: El equipo prepara el CanSat antes del lanzamiento. Foto: Ana López.</w:t>
-      </w:r>
-    </w:p>
-    <w:p>
-      <w:pPr>
-        <w:pStyle w:val="ListBullet"/>
-      </w:pPr>
-      <w:r>
-        <w:rPr>
-          <w:rFonts w:ascii="Calibri" w:hAnsi="Calibri"/>
-          <w:b w:val="0"/>
-          <w:i w:val="0"/>
-          <w:color w:val="171B23"/>
-          <w:sz w:val="22"/>
-        </w:rPr>
-        <w:t>Numera en orden: [IMAGEN 1], [IMAGEN 2], [IMAGEN 3]...</w:t>
-      </w:r>
-    </w:p>
-    <w:p>
-      <w:pPr>
-        <w:pStyle w:val="ListBullet"/>
-      </w:pPr>
-      <w:r>
-        <w:rPr>
-          <w:rFonts w:ascii="Calibri" w:hAnsi="Calibri"/>
-          <w:b w:val="0"/>
-          <w:i w:val="0"/>
-          <w:color w:val="171B23"/>
-          <w:sz w:val="22"/>
-        </w:rPr>
-        <w:t>RUTA debe coincidir exactamente con el archivo dentro de la carpeta.</w:t>
-      </w:r>
-    </w:p>
-    <w:p>
-      <w:pPr>
-        <w:pStyle w:val="ListBullet"/>
-      </w:pPr>
-      <w:r>
-        <w:rPr>
-          <w:rFonts w:ascii="Calibri" w:hAnsi="Calibri"/>
-          <w:b w:val="0"/>
-          <w:i w:val="0"/>
-          <w:color w:val="171B23"/>
-          <w:sz w:val="22"/>
-        </w:rPr>
-        <w:t>El pie debe explicar qué ocurre, identificar personas relevantes y dar crédito cuando corresponda.</w:t>
-      </w:r>
-    </w:p>
-    <w:p>
-      <w:pPr>
-        <w:pStyle w:val="ListBullet"/>
-      </w:pPr>
-      <w:r>
-        <w:rPr>
-          <w:rFonts w:ascii="Calibri" w:hAnsi="Calibri"/>
-          <w:b w:val="0"/>
-          <w:i w:val="0"/>
-          <w:color w:val="171B23"/>
-          <w:sz w:val="22"/>
-        </w:rPr>
-        <w:t>Envía JPG, PNG o WebP en la mayor resolución disponible. No pegues capturas dentro del documento.</w:t>
-      </w:r>
-    </w:p>
-    <w:p>
-      <w:r>
-        <w:br w:type="page"/>
-      </w:r>
-    </w:p>
-    <w:p>
-      <w:pPr>
-        <w:pStyle w:val="Heading1"/>
-      </w:pPr>
-      <w:r>
-        <w:t>4. Ejemplo completo</w:t>
-      </w:r>
-    </w:p>
-    <w:p>
-      <w:pPr>
-        <w:spacing w:before="0" w:after="120" w:line="300" w:lineRule="auto"/>
-      </w:pPr>
-      <w:r>
-        <w:rPr>
-          <w:rFonts w:ascii="Calibri" w:hAnsi="Calibri"/>
-          <w:b w:val="0"/>
-          <w:i w:val="0"/>
-          <w:color w:val="171B23"/>
-          <w:sz w:val="22"/>
-        </w:rPr>
-        <w:t>Este ejemplo puede pasar directamente por la vista previa del editor.</w:t>
-      </w:r>
-    </w:p>
-    <w:p>
-      <w:pPr>
-        <w:pStyle w:val="CodeBlock"/>
-      </w:pPr>
-      <w:r>
-        <w:rPr>
-          <w:rFonts w:ascii="Courier New" w:hAnsi="Courier New"/>
-          <w:b w:val="0"/>
-          <w:i w:val="0"/>
-          <w:color w:val="171B23"/>
-          <w:sz w:val="17"/>
-        </w:rPr>
-        <w:t>TÍTULO: La primera misión de nuestro equipo CanSat</w:t>
-      </w:r>
-      <w:r>
-        <w:br/>
-      </w:r>
-      <w:r>
-        <w:rPr>
-          <w:rFonts w:ascii="Courier New" w:hAnsi="Courier New"/>
-          <w:b w:val="0"/>
-          <w:i w:val="0"/>
-          <w:color w:val="171B23"/>
-          <w:sz w:val="17"/>
-        </w:rPr>
-        <w:t>AUTOR: Andrea Pérez López</w:t>
-      </w:r>
-      <w:r>
-        <w:br/>
-      </w:r>
-      <w:r>
-        <w:rPr>
-          <w:rFonts w:ascii="Courier New" w:hAnsi="Courier New"/>
-          <w:b w:val="0"/>
-          <w:i w:val="0"/>
-          <w:color w:val="171B23"/>
-          <w:sz w:val="17"/>
-        </w:rPr>
-        <w:t>CATEGORÍA: Ingeniería</w:t>
-      </w:r>
-      <w:r>
-        <w:br/>
-      </w:r>
-      <w:r>
-        <w:rPr>
-          <w:rFonts w:ascii="Courier New" w:hAnsi="Courier New"/>
-          <w:b w:val="0"/>
-          <w:i w:val="0"/>
-          <w:color w:val="171B23"/>
-          <w:sz w:val="17"/>
-        </w:rPr>
-        <w:t>BAJADA: Diseñar un satélite del tamaño de una lata nos enseñó a convertir límites reales en decisiones de ingeniería.</w:t>
-      </w:r>
-      <w:r>
-        <w:br/>
-      </w:r>
-      <w:r>
-        <w:rPr>
-          <w:rFonts w:ascii="Courier New" w:hAnsi="Courier New"/>
-          <w:b w:val="0"/>
-          <w:i w:val="0"/>
-          <w:color w:val="171B23"/>
-          <w:sz w:val="17"/>
-        </w:rPr>
-        <w:t>EDICIÓN: julio-2026</w:t>
+        <w:t>TIEMPO DE LECTURA: 8</w:t>
       </w:r>
       <w:r>
         <w:br/>
@@ -1287,7 +1207,30 @@
           <w:color w:val="171B23"/>
           <w:sz w:val="17"/>
         </w:rPr>
-        <w:t>## Una misión pequeña con preguntas grandes</w:t>
+        <w:t>## Aqui empieza el cuerpo</w:t>
+      </w:r>
+    </w:p>
+    <w:p>
+      <w:pPr>
+        <w:pStyle w:val="Heading2"/>
+      </w:pPr>
+      <w:r>
+        <w:t>Senales dentro del texto</w:t>
+      </w:r>
+    </w:p>
+    <w:p>
+      <w:pPr>
+        <w:pStyle w:val="CodeBlock"/>
+      </w:pPr>
+      <w:r>
+        <w:rPr>
+          <w:rFonts w:ascii="Courier New" w:hAnsi="Courier New"/>
+          <w:b w:val="0"/>
+          <w:i w:val="0"/>
+          <w:color w:val="171B23"/>
+          <w:sz w:val="17"/>
+        </w:rPr>
+        <w:t>## Un subtitulo</w:t>
       </w:r>
       <w:r>
         <w:br/>
@@ -1312,7 +1255,312 @@
           <w:color w:val="171B23"/>
           <w:sz w:val="17"/>
         </w:rPr>
-        <w:t>Nuestro equipo comenzó con una pregunta sencilla: ¿cuántos sistemas podíamos integrar dentro del volumen de una lata sin perder confiabilidad?</w:t>
+        <w:t>&gt; Una cita destacada</w:t>
+      </w:r>
+    </w:p>
+    <w:p>
+      <w:pPr>
+        <w:pStyle w:val="ListBullet"/>
+      </w:pPr>
+      <w:r>
+        <w:rPr>
+          <w:rFonts w:ascii="Calibri" w:hAnsi="Calibri"/>
+          <w:b w:val="0"/>
+          <w:i w:val="0"/>
+          <w:color w:val="171B23"/>
+          <w:sz w:val="22"/>
+        </w:rPr>
+        <w:t>Dos signos ## convierten esa linea en subtitulo.</w:t>
+      </w:r>
+    </w:p>
+    <w:p>
+      <w:pPr>
+        <w:pStyle w:val="ListBullet"/>
+      </w:pPr>
+      <w:r>
+        <w:rPr>
+          <w:rFonts w:ascii="Calibri" w:hAnsi="Calibri"/>
+          <w:b w:val="0"/>
+          <w:i w:val="0"/>
+          <w:color w:val="171B23"/>
+          <w:sz w:val="22"/>
+        </w:rPr>
+        <w:t>El signo &gt; al inicio convierte la frase en una cita destacada.</w:t>
+      </w:r>
+    </w:p>
+    <w:p>
+      <w:pPr>
+        <w:pStyle w:val="ListBullet"/>
+      </w:pPr>
+      <w:r>
+        <w:rPr>
+          <w:rFonts w:ascii="Calibri" w:hAnsi="Calibri"/>
+          <w:b w:val="0"/>
+          <w:i w:val="0"/>
+          <w:color w:val="171B23"/>
+          <w:sz w:val="22"/>
+        </w:rPr>
+        <w:t>Deja una linea vacia entre parrafos para que el texto sea facil de revisar.</w:t>
+      </w:r>
+    </w:p>
+    <w:p>
+      <w:pPr>
+        <w:pStyle w:val="Heading2"/>
+      </w:pPr>
+      <w:r>
+        <w:t>Imagenes y pies de foto</w:t>
+      </w:r>
+    </w:p>
+    <w:p>
+      <w:pPr>
+        <w:spacing w:before="0" w:after="120" w:line="300" w:lineRule="auto"/>
+      </w:pPr>
+      <w:r>
+        <w:rPr>
+          <w:rFonts w:ascii="Calibri" w:hAnsi="Calibri"/>
+          <w:b w:val="0"/>
+          <w:i w:val="0"/>
+          <w:color w:val="171B23"/>
+          <w:sz w:val="22"/>
+        </w:rPr>
+        <w:t>Coloca el bloque exactamente en el lugar donde quieres que aparezca la imagen. Cada linea tiene un proposito especifico.</w:t>
+      </w:r>
+    </w:p>
+    <w:p>
+      <w:pPr>
+        <w:pStyle w:val="CodeBlock"/>
+      </w:pPr>
+      <w:r>
+        <w:rPr>
+          <w:rFonts w:ascii="Courier New" w:hAnsi="Courier New"/>
+          <w:b w:val="0"/>
+          <w:i w:val="0"/>
+          <w:color w:val="171B23"/>
+          <w:sz w:val="17"/>
+        </w:rPr>
+        <w:t>[IMAGEN 1]</w:t>
+      </w:r>
+      <w:r>
+        <w:br/>
+      </w:r>
+      <w:r>
+        <w:rPr>
+          <w:rFonts w:ascii="Courier New" w:hAnsi="Courier New"/>
+          <w:b w:val="0"/>
+          <w:i w:val="0"/>
+          <w:color w:val="171B23"/>
+          <w:sz w:val="17"/>
+        </w:rPr>
+        <w:t>RUTA: foto-del-evento.webp</w:t>
+      </w:r>
+      <w:r>
+        <w:br/>
+      </w:r>
+      <w:r>
+        <w:rPr>
+          <w:rFonts w:ascii="Courier New" w:hAnsi="Courier New"/>
+          <w:b w:val="0"/>
+          <w:i w:val="0"/>
+          <w:color w:val="171B23"/>
+          <w:sz w:val="17"/>
+        </w:rPr>
+        <w:t>PIE DE FOTO: El equipo prepara el CanSat antes del lanzamiento. Foto: Ana Lopez.</w:t>
+      </w:r>
+    </w:p>
+    <w:p>
+      <w:pPr>
+        <w:pStyle w:val="ListBullet"/>
+      </w:pPr>
+      <w:r>
+        <w:rPr>
+          <w:rFonts w:ascii="Calibri" w:hAnsi="Calibri"/>
+          <w:b w:val="0"/>
+          <w:i w:val="0"/>
+          <w:color w:val="171B23"/>
+          <w:sz w:val="22"/>
+        </w:rPr>
+        <w:t>Numera en orden: [IMAGEN 1], [IMAGEN 2], [IMAGEN 3]...</w:t>
+      </w:r>
+    </w:p>
+    <w:p>
+      <w:pPr>
+        <w:pStyle w:val="ListBullet"/>
+      </w:pPr>
+      <w:r>
+        <w:rPr>
+          <w:rFonts w:ascii="Calibri" w:hAnsi="Calibri"/>
+          <w:b w:val="0"/>
+          <w:i w:val="0"/>
+          <w:color w:val="171B23"/>
+          <w:sz w:val="22"/>
+        </w:rPr>
+        <w:t>RUTA debe coincidir exactamente con el nombre del archivo dentro de la carpeta, incluyendo la extension.</w:t>
+      </w:r>
+    </w:p>
+    <w:p>
+      <w:pPr>
+        <w:pStyle w:val="ListBullet"/>
+      </w:pPr>
+      <w:r>
+        <w:rPr>
+          <w:rFonts w:ascii="Calibri" w:hAnsi="Calibri"/>
+          <w:b w:val="0"/>
+          <w:i w:val="0"/>
+          <w:color w:val="171B23"/>
+          <w:sz w:val="22"/>
+        </w:rPr>
+        <w:t>El pie debe explicar que ocurre, identificar personas relevantes y dar credito al autor de la foto.</w:t>
+      </w:r>
+    </w:p>
+    <w:p>
+      <w:pPr>
+        <w:pStyle w:val="ListBullet"/>
+      </w:pPr>
+      <w:r>
+        <w:rPr>
+          <w:rFonts w:ascii="Calibri" w:hAnsi="Calibri"/>
+          <w:b w:val="0"/>
+          <w:i w:val="0"/>
+          <w:color w:val="171B23"/>
+          <w:sz w:val="22"/>
+        </w:rPr>
+        <w:t>Envia JPG, PNG o WebP en la mayor resolucion disponible. No pegues capturas dentro del documento de texto.</w:t>
+      </w:r>
+    </w:p>
+    <w:p>
+      <w:r>
+        <w:br w:type="page"/>
+      </w:r>
+    </w:p>
+    <w:p>
+      <w:pPr>
+        <w:pStyle w:val="Heading1"/>
+      </w:pPr>
+      <w:r>
+        <w:t>4. Ejemplo completo</w:t>
+      </w:r>
+    </w:p>
+    <w:p>
+      <w:pPr>
+        <w:spacing w:before="0" w:after="120" w:line="300" w:lineRule="auto"/>
+      </w:pPr>
+      <w:r>
+        <w:rPr>
+          <w:rFonts w:ascii="Calibri" w:hAnsi="Calibri"/>
+          <w:b w:val="0"/>
+          <w:i w:val="0"/>
+          <w:color w:val="171B23"/>
+          <w:sz w:val="22"/>
+        </w:rPr>
+        <w:t>Este archivo listo para publicar puede copiarse y adaptarse para una entrega real.</w:t>
+      </w:r>
+    </w:p>
+    <w:p>
+      <w:pPr>
+        <w:spacing w:before="0" w:after="60" w:line="300" w:lineRule="auto"/>
+      </w:pPr>
+      <w:r>
+        <w:rPr>
+          <w:rFonts w:ascii="Calibri" w:hAnsi="Calibri"/>
+          <w:b w:val="0"/>
+          <w:i w:val="0"/>
+          <w:color w:val="506AB8"/>
+          <w:sz w:val="19"/>
+        </w:rPr>
+        <w:t>ARCHIVO COMPLETO: articulo.md</w:t>
+      </w:r>
+    </w:p>
+    <w:p>
+      <w:pPr>
+        <w:pStyle w:val="CodeBlock"/>
+      </w:pPr>
+      <w:r>
+        <w:rPr>
+          <w:rFonts w:ascii="Courier New" w:hAnsi="Courier New"/>
+          <w:b w:val="0"/>
+          <w:i w:val="0"/>
+          <w:color w:val="171B23"/>
+          <w:sz w:val="17"/>
+        </w:rPr>
+        <w:t>TITULO: La primera mision de nuestro equipo CanSat</w:t>
+      </w:r>
+      <w:r>
+        <w:br/>
+      </w:r>
+      <w:r>
+        <w:rPr>
+          <w:rFonts w:ascii="Courier New" w:hAnsi="Courier New"/>
+          <w:b w:val="0"/>
+          <w:i w:val="0"/>
+          <w:color w:val="171B23"/>
+          <w:sz w:val="17"/>
+        </w:rPr>
+        <w:t>AUTOR: Andrea Perez Lopez</w:t>
+      </w:r>
+      <w:r>
+        <w:br/>
+      </w:r>
+      <w:r>
+        <w:rPr>
+          <w:rFonts w:ascii="Courier New" w:hAnsi="Courier New"/>
+          <w:b w:val="0"/>
+          <w:i w:val="0"/>
+          <w:color w:val="171B23"/>
+          <w:sz w:val="17"/>
+        </w:rPr>
+        <w:t>CATEGORIA: Ingenieria</w:t>
+      </w:r>
+      <w:r>
+        <w:br/>
+      </w:r>
+      <w:r>
+        <w:rPr>
+          <w:rFonts w:ascii="Courier New" w:hAnsi="Courier New"/>
+          <w:b w:val="0"/>
+          <w:i w:val="0"/>
+          <w:color w:val="171B23"/>
+          <w:sz w:val="17"/>
+        </w:rPr>
+        <w:t>SUBTITULO: Disenar un satelite del tamano de una lata nos enseno</w:t>
+      </w:r>
+      <w:r>
+        <w:br/>
+      </w:r>
+      <w:r>
+        <w:rPr>
+          <w:rFonts w:ascii="Courier New" w:hAnsi="Courier New"/>
+          <w:b w:val="0"/>
+          <w:i w:val="0"/>
+          <w:color w:val="171B23"/>
+          <w:sz w:val="17"/>
+        </w:rPr>
+        <w:t xml:space="preserve">  a convertir limites reales en decisiones de ingenieria.</w:t>
+      </w:r>
+      <w:r>
+        <w:br/>
+      </w:r>
+      <w:r>
+        <w:rPr>
+          <w:rFonts w:ascii="Courier New" w:hAnsi="Courier New"/>
+          <w:b w:val="0"/>
+          <w:i w:val="0"/>
+          <w:color w:val="171B23"/>
+          <w:sz w:val="17"/>
+        </w:rPr>
+        <w:t>EDICION: julio-2026</w:t>
+      </w:r>
+      <w:r>
+        <w:br/>
+      </w:r>
+      <w:r>
+        <w:rPr>
+          <w:rFonts w:ascii="Courier New" w:hAnsi="Courier New"/>
+          <w:b w:val="0"/>
+          <w:i w:val="0"/>
+          <w:color w:val="171B23"/>
+          <w:sz w:val="17"/>
+        </w:rPr>
+        <w:t>TIEMPO DE LECTURA: 8</w:t>
       </w:r>
       <w:r>
         <w:br/>
@@ -1337,7 +1585,7 @@
           <w:color w:val="171B23"/>
           <w:sz w:val="17"/>
         </w:rPr>
-        <w:t>Durante tres meses diseñamos la alimentación, la telemetría y el sistema de recuperación. Cada prueba dejó datos y una lista clara de cambios.</w:t>
+        <w:t>---</w:t>
       </w:r>
       <w:r>
         <w:br/>
@@ -1362,7 +1610,7 @@
           <w:color w:val="171B23"/>
           <w:sz w:val="17"/>
         </w:rPr>
-        <w:t>&gt; El prototipo mejoró cuando dejamos de ocultar los errores y empezamos a documentarlos.</w:t>
+        <w:t>## Una mision pequena con preguntas grandes</w:t>
       </w:r>
       <w:r>
         <w:br/>
@@ -1387,7 +1635,33 @@
           <w:color w:val="171B23"/>
           <w:sz w:val="17"/>
         </w:rPr>
-        <w:t>## El día del lanzamiento</w:t>
+        <w:t>Nuestro equipo comenzo con una pregunta sencilla: cuantos sistemas</w:t>
+      </w:r>
+      <w:r>
+        <w:br/>
+      </w:r>
+      <w:r>
+        <w:rPr>
+          <w:rFonts w:ascii="Courier New" w:hAnsi="Courier New"/>
+          <w:b w:val="0"/>
+          <w:i w:val="0"/>
+          <w:color w:val="171B23"/>
+          <w:sz w:val="17"/>
+        </w:rPr>
+        <w:t>podiamos integrar dentro del volumen de una lata sin perder</w:t>
+      </w:r>
+      <w:r>
+        <w:br/>
+      </w:r>
+      <w:r>
+        <w:rPr>
+          <w:rFonts w:ascii="Courier New" w:hAnsi="Courier New"/>
+          <w:b w:val="0"/>
+          <w:i w:val="0"/>
+          <w:color w:val="171B23"/>
+          <w:sz w:val="17"/>
+        </w:rPr>
+        <w:t>confiabilidad?</w:t>
       </w:r>
       <w:r>
         <w:br/>
@@ -1412,7 +1686,147 @@
           <w:color w:val="171B23"/>
           <w:sz w:val="17"/>
         </w:rPr>
-        <w:t>La mañana del lanzamiento revisamos conexiones, batería y recepción de datos. El descenso fue estable y recuperamos el CanSat sin daños.</w:t>
+        <w:t>Durante tres meses disenamos la alimentacion, la telemetria y el</w:t>
+      </w:r>
+      <w:r>
+        <w:br/>
+      </w:r>
+      <w:r>
+        <w:rPr>
+          <w:rFonts w:ascii="Courier New" w:hAnsi="Courier New"/>
+          <w:b w:val="0"/>
+          <w:i w:val="0"/>
+          <w:color w:val="171B23"/>
+          <w:sz w:val="17"/>
+        </w:rPr>
+        <w:t>sistema de recuperacion. Cada prueba dejo datos y una lista clara</w:t>
+      </w:r>
+      <w:r>
+        <w:br/>
+      </w:r>
+      <w:r>
+        <w:rPr>
+          <w:rFonts w:ascii="Courier New" w:hAnsi="Courier New"/>
+          <w:b w:val="0"/>
+          <w:i w:val="0"/>
+          <w:color w:val="171B23"/>
+          <w:sz w:val="17"/>
+        </w:rPr>
+        <w:t>de cambios.</w:t>
+      </w:r>
+      <w:r>
+        <w:br/>
+      </w:r>
+      <w:r>
+        <w:rPr>
+          <w:rFonts w:ascii="Courier New" w:hAnsi="Courier New"/>
+          <w:b w:val="0"/>
+          <w:i w:val="0"/>
+          <w:color w:val="171B23"/>
+          <w:sz w:val="17"/>
+        </w:rPr>
+      </w:r>
+      <w:r>
+        <w:br/>
+      </w:r>
+      <w:r>
+        <w:rPr>
+          <w:rFonts w:ascii="Courier New" w:hAnsi="Courier New"/>
+          <w:b w:val="0"/>
+          <w:i w:val="0"/>
+          <w:color w:val="171B23"/>
+          <w:sz w:val="17"/>
+        </w:rPr>
+        <w:t>&gt; El prototipo mejoro cuando dejamos de ocultar los errores y</w:t>
+      </w:r>
+      <w:r>
+        <w:br/>
+      </w:r>
+      <w:r>
+        <w:rPr>
+          <w:rFonts w:ascii="Courier New" w:hAnsi="Courier New"/>
+          <w:b w:val="0"/>
+          <w:i w:val="0"/>
+          <w:color w:val="171B23"/>
+          <w:sz w:val="17"/>
+        </w:rPr>
+        <w:t>empezamos a documentarlos. -- Andrea Perez, responsable de</w:t>
+      </w:r>
+      <w:r>
+        <w:br/>
+      </w:r>
+      <w:r>
+        <w:rPr>
+          <w:rFonts w:ascii="Courier New" w:hAnsi="Courier New"/>
+          <w:b w:val="0"/>
+          <w:i w:val="0"/>
+          <w:color w:val="171B23"/>
+          <w:sz w:val="17"/>
+        </w:rPr>
+        <w:t>telemetria.</w:t>
+      </w:r>
+      <w:r>
+        <w:br/>
+      </w:r>
+      <w:r>
+        <w:rPr>
+          <w:rFonts w:ascii="Courier New" w:hAnsi="Courier New"/>
+          <w:b w:val="0"/>
+          <w:i w:val="0"/>
+          <w:color w:val="171B23"/>
+          <w:sz w:val="17"/>
+        </w:rPr>
+      </w:r>
+      <w:r>
+        <w:br/>
+      </w:r>
+      <w:r>
+        <w:rPr>
+          <w:rFonts w:ascii="Courier New" w:hAnsi="Courier New"/>
+          <w:b w:val="0"/>
+          <w:i w:val="0"/>
+          <w:color w:val="171B23"/>
+          <w:sz w:val="17"/>
+        </w:rPr>
+        <w:t>## El dia del lanzamiento</w:t>
+      </w:r>
+      <w:r>
+        <w:br/>
+      </w:r>
+      <w:r>
+        <w:rPr>
+          <w:rFonts w:ascii="Courier New" w:hAnsi="Courier New"/>
+          <w:b w:val="0"/>
+          <w:i w:val="0"/>
+          <w:color w:val="171B23"/>
+          <w:sz w:val="17"/>
+        </w:rPr>
+      </w:r>
+      <w:r>
+        <w:br/>
+      </w:r>
+      <w:r>
+        <w:rPr>
+          <w:rFonts w:ascii="Courier New" w:hAnsi="Courier New"/>
+          <w:b w:val="0"/>
+          <w:i w:val="0"/>
+          <w:color w:val="171B23"/>
+          <w:sz w:val="17"/>
+        </w:rPr>
+        <w:t>La manana del lanzamiento revisamos conexiones, bateria y recepcion</w:t>
+      </w:r>
+      <w:r>
+        <w:br/>
+      </w:r>
+      <w:r>
+        <w:rPr>
+          <w:rFonts w:ascii="Courier New" w:hAnsi="Courier New"/>
+          <w:b w:val="0"/>
+          <w:i w:val="0"/>
+          <w:color w:val="171B23"/>
+          <w:sz w:val="17"/>
+        </w:rPr>
+        <w:t>de datos. El descenso fue estable y recuperamos el CanSat sin danos.</w:t>
       </w:r>
       <w:r>
         <w:br/>
@@ -1463,7 +1877,20 @@
           <w:color w:val="171B23"/>
           <w:sz w:val="17"/>
         </w:rPr>
-        <w:t>PIE DE FOTO: El equipo verifica la telemetría minutos antes del lanzamiento. Foto: Andrea Pérez.</w:t>
+        <w:t>PIE DE FOTO: El equipo verifica la telemetria minutos antes del</w:t>
+      </w:r>
+      <w:r>
+        <w:br/>
+      </w:r>
+      <w:r>
+        <w:rPr>
+          <w:rFonts w:ascii="Courier New" w:hAnsi="Courier New"/>
+          <w:b w:val="0"/>
+          <w:i w:val="0"/>
+          <w:color w:val="171B23"/>
+          <w:sz w:val="17"/>
+        </w:rPr>
+        <w:t xml:space="preserve">  lanzamiento. Foto: Andrea Perez.</w:t>
       </w:r>
       <w:r>
         <w:br/>
@@ -1513,7 +1940,63 @@
           <w:color w:val="171B23"/>
           <w:sz w:val="17"/>
         </w:rPr>
-        <w:t>La siguiente versión incorporará un sensor ambiental y una carcasa más ligera. También publicaremos el registro de pruebas para que otros equipos puedan aprender del proceso.</w:t>
+        <w:t>La siguiente version incorporara un sensor ambiental y una carcasa</w:t>
+      </w:r>
+      <w:r>
+        <w:br/>
+      </w:r>
+      <w:r>
+        <w:rPr>
+          <w:rFonts w:ascii="Courier New" w:hAnsi="Courier New"/>
+          <w:b w:val="0"/>
+          <w:i w:val="0"/>
+          <w:color w:val="171B23"/>
+          <w:sz w:val="17"/>
+        </w:rPr>
+        <w:t>mas ligera. Tambien publicaremos el registro de pruebas para que</w:t>
+      </w:r>
+      <w:r>
+        <w:br/>
+      </w:r>
+      <w:r>
+        <w:rPr>
+          <w:rFonts w:ascii="Courier New" w:hAnsi="Courier New"/>
+          <w:b w:val="0"/>
+          <w:i w:val="0"/>
+          <w:color w:val="171B23"/>
+          <w:sz w:val="17"/>
+        </w:rPr>
+        <w:t>otros equipos puedan aprender del proceso.</w:t>
+      </w:r>
+    </w:p>
+    <w:p>
+      <w:pPr>
+        <w:spacing w:before="100" w:after="200" w:line="288" w:lineRule="auto"/>
+        <w:ind w:left="259" w:right="173"/>
+        <w:shd w:fill="E8EEF9"/>
+        <w:pBdr>
+          <w:left w:val="single" w:sz="18" w:space="8" w:color="506AB8"/>
+        </w:pBdr>
+      </w:pPr>
+      <w:r>
+        <w:rPr>
+          <w:rFonts w:ascii="Calibri" w:hAnsi="Calibri"/>
+          <w:b/>
+          <w:i w:val="0"/>
+          <w:color w:val="506AB8"/>
+          <w:sz w:val="19"/>
+        </w:rPr>
+        <w:t xml:space="preserve">LA IDEA  </w:t>
+      </w:r>
+      <w:r>
+        <w:rPr>
+          <w:rFonts w:ascii="Calibri" w:hAnsi="Calibri"/>
+          <w:b w:val="0"/>
+          <w:i w:val="0"/>
+          <w:color w:val="171B23"/>
+          <w:sz w:val="21"/>
+        </w:rPr>
+        <w:t>El texto conserva tu voz. Los encabezados, citas y bloques de imagen solo le indican al editor como convertirlo en una historia legible en el sitio.</w:t>
       </w:r>
     </w:p>
     <w:p>
@@ -1531,7 +2014,7 @@
     </w:p>
     <w:p>
       <w:pPr>
-        <w:pStyle w:val="ListBullet"/>
+        <w:spacing w:before="0" w:after="120" w:line="300" w:lineRule="auto"/>
       </w:pPr>
       <w:r>
         <w:rPr>
@@ -1541,7 +2024,7 @@
           <w:color w:val="171B23"/>
           <w:sz w:val="22"/>
         </w:rPr>
-        <w:t>El archivo incluye TÍTULO, AUTOR y CATEGORÍA.</w:t>
+        <w:t>Esta lista de verificacion te toma dos minutos y evita la mayoria de las correcciones posteriores.</w:t>
       </w:r>
     </w:p>
     <w:p>
@@ -1556,7 +2039,7 @@
           <w:color w:val="171B23"/>
           <w:sz w:val="22"/>
         </w:rPr>
-        <w:t>La línea --- aparece entre los datos y el artículo.</w:t>
+        <w:t>El archivo incluye TITULO, AUTOR y CATEGORIA.</w:t>
       </w:r>
     </w:p>
     <w:p>
@@ -1571,7 +2054,7 @@
           <w:color w:val="171B23"/>
           <w:sz w:val="22"/>
         </w:rPr>
-        <w:t>Los subtítulos comienzan con ##.</w:t>
+        <w:t>El SUBTITULO esta presente (una o dos frases).</w:t>
       </w:r>
     </w:p>
     <w:p>
@@ -1586,7 +2069,67 @@
           <w:color w:val="171B23"/>
           <w:sz w:val="22"/>
         </w:rPr>
-        <w:t>Cada imagen está dentro de la carpeta y tiene un bloque numerado.</w:t>
+        <w:t>TIEMPO DE LECTURA contiene un numero entero de minutos (opcional).</w:t>
+      </w:r>
+    </w:p>
+    <w:p>
+      <w:pPr>
+        <w:pStyle w:val="ListBullet"/>
+      </w:pPr>
+      <w:r>
+        <w:rPr>
+          <w:rFonts w:ascii="Calibri" w:hAnsi="Calibri"/>
+          <w:b w:val="0"/>
+          <w:i w:val="0"/>
+          <w:color w:val="171B23"/>
+          <w:sz w:val="22"/>
+        </w:rPr>
+        <w:t>La linea --- aparece sola entre los metadatos y el cuerpo.</w:t>
+      </w:r>
+    </w:p>
+    <w:p>
+      <w:pPr>
+        <w:pStyle w:val="ListBullet"/>
+      </w:pPr>
+      <w:r>
+        <w:rPr>
+          <w:rFonts w:ascii="Calibri" w:hAnsi="Calibri"/>
+          <w:b w:val="0"/>
+          <w:i w:val="0"/>
+          <w:color w:val="171B23"/>
+          <w:sz w:val="22"/>
+        </w:rPr>
+        <w:t>Los subtitulos comienzan con ##.</w:t>
+      </w:r>
+    </w:p>
+    <w:p>
+      <w:pPr>
+        <w:pStyle w:val="ListBullet"/>
+      </w:pPr>
+      <w:r>
+        <w:rPr>
+          <w:rFonts w:ascii="Calibri" w:hAnsi="Calibri"/>
+          <w:b w:val="0"/>
+          <w:i w:val="0"/>
+          <w:color w:val="171B23"/>
+          <w:sz w:val="22"/>
+        </w:rPr>
+        <w:t>Las citas comienzan con &gt; e incluyen atribucion cuando corresponde.</w:t>
+      </w:r>
+    </w:p>
+    <w:p>
+      <w:pPr>
+        <w:pStyle w:val="ListBullet"/>
+      </w:pPr>
+      <w:r>
+        <w:rPr>
+          <w:rFonts w:ascii="Calibri" w:hAnsi="Calibri"/>
+          <w:b w:val="0"/>
+          <w:i w:val="0"/>
+          <w:color w:val="171B23"/>
+          <w:sz w:val="22"/>
+        </w:rPr>
+        <w:t>Cada imagen esta dentro de la carpeta y tiene un bloque [IMAGEN N].</w:t>
       </w:r>
     </w:p>
     <w:p>
@@ -1616,7 +2159,7 @@
           <w:color w:val="171B23"/>
           <w:sz w:val="22"/>
         </w:rPr>
-        <w:t>Cada imagen tiene PIE DE FOTO y crédito cuando corresponde.</w:t>
+        <w:t>Cada imagen tiene PIE DE FOTO y credito del autor.</w:t>
       </w:r>
     </w:p>
     <w:p>
@@ -1631,7 +2174,7 @@
           <w:color w:val="171B23"/>
           <w:sz w:val="22"/>
         </w:rPr>
-        <w:t>Revisaste ortografía, nombres propios, cifras y enlaces.</w:t>
+        <w:t>Revisaste ortografia, nombres propios, cifras y fuentes.</w:t>
       </w:r>
     </w:p>
     <w:p>
@@ -1646,7 +2189,7 @@
           <w:color w:val="171B23"/>
           <w:sz w:val="22"/>
         </w:rPr>
-        <w:t>La carpeta abre correctamente después de comprimirla como .zip.</w:t>
+        <w:t>La carpeta abre correctamente despues de comprimirla como .zip.</w:t>
       </w:r>
     </w:p>
     <w:p>
@@ -1654,7 +2197,7 @@
         <w:pStyle w:val="Heading1"/>
       </w:pPr>
       <w:r>
-        <w:t>Cómo enviar la carpeta</w:t>
+        <w:t>Como enviar la carpeta</w:t>
       </w:r>
     </w:p>
     <w:p>
@@ -1673,7 +2216,7 @@
           <w:color w:val="171B23"/>
           <w:sz w:val="22"/>
         </w:rPr>
-        <w:t xml:space="preserve">Comprímela. </w:t>
+        <w:t xml:space="preserve">Comprimela. </w:t>
       </w:r>
       <w:r>
         <w:rPr>
@@ -1683,7 +2226,7 @@
           <w:color w:val="171B23"/>
           <w:sz w:val="22"/>
         </w:rPr>
-        <w:t>En Windows: clic derecho sobre la carpeta &gt; Comprimir en archivo ZIP. En macOS: clic derecho &gt; Comprimir.</w:t>
+        <w:t>En Windows: clic derecho sobre la carpeta &gt; Enviar a &gt; Carpeta comprimida (en ZIP). En macOS: clic derecho &gt; Comprimir.</w:t>
       </w:r>
     </w:p>
     <w:p>
@@ -1712,7 +2255,7 @@
           <w:color w:val="171B23"/>
           <w:sz w:val="22"/>
         </w:rPr>
-        <w:t>Usa tu apellido y un título corto, por ejemplo: perez-mision-cansat.zip.</w:t>
+        <w:t>Usa tu apellido y un titulo corto, por ejemplo: perez-mision-cansat.zip.</w:t>
       </w:r>
     </w:p>
     <w:p>
@@ -1731,7 +2274,7 @@
           <w:color w:val="171B23"/>
           <w:sz w:val="22"/>
         </w:rPr>
-        <w:t xml:space="preserve">Envíalo. </w:t>
+        <w:t xml:space="preserve">Enviolo. </w:t>
       </w:r>
       <w:r>
         <w:rPr>
@@ -1741,16 +2284,16 @@
           <w:color w:val="171B23"/>
           <w:sz w:val="22"/>
         </w:rPr>
-        <w:t>Adjunta el ZIP por el medio acordado con el responsable editorial y escribe tu nombre y título en el mensaje.</w:t>
+        <w:t>Adjunta el ZIP por el medio acordado con el responsable editorial e incluye tu nombre y el titulo del articulo en el mensaje.</w:t>
       </w:r>
     </w:p>
     <w:p>
       <w:pPr>
         <w:spacing w:before="100" w:after="200" w:line="288" w:lineRule="auto"/>
         <w:ind w:left="259" w:right="173"/>
-        <w:shd w:fill="E8EEF9"/>
+        <w:shd w:fill="FCEEEB"/>
         <w:pBdr>
-          <w:left w:val="single" w:sz="18" w:space="8" w:color="506AB8"/>
+          <w:left w:val="single" w:sz="18" w:space="8" w:color="C8463A"/>
         </w:pBdr>
       </w:pPr>
       <w:r>
@@ -1758,7 +2301,7 @@
           <w:rFonts w:ascii="Calibri" w:hAnsi="Calibri"/>
           <w:b/>
           <w:i w:val="0"/>
-          <w:color w:val="506AB8"/>
+          <w:color w:val="C8463A"/>
           <w:sz w:val="19"/>
         </w:rPr>
         <w:t xml:space="preserve">SI EL ARCHIVO PESA DEMASIADO  </w:t>
@@ -1771,7 +2314,7 @@
           <w:color w:val="171B23"/>
           <w:sz w:val="21"/>
         </w:rPr>
-        <w:t>Comparte una carpeta de Drive con permiso de lectura y no muevas ni renombres archivos después de enviar el enlace.</w:t>
+        <w:t>Comparte una carpeta de Drive o similar con permiso de lectura. No muevas ni renombres archivos despues de enviar el enlace.</w:t>
       </w:r>
     </w:p>
     <w:p>
@@ -1794,7 +2337,7 @@
           <w:color w:val="171B23"/>
           <w:sz w:val="22"/>
         </w:rPr>
-        <w:t>No necesitas diseñar la página ni acomodar tamaños para web.</w:t>
+        <w:t>No necesitas disenar la pagina ni acomodar tamanos para web.</w:t>
       </w:r>
     </w:p>
     <w:p>
@@ -1824,7 +2367,7 @@
           <w:color w:val="171B23"/>
           <w:sz w:val="22"/>
         </w:rPr>
-        <w:t>No necesitas convertir las imágenes: envía los originales y el editor resolverá la publicación.</w:t>
+        <w:t>No necesitas convertir las imagenes: envia los originales y el editor resolvera la publicacion.</w:t>
       </w:r>
     </w:p>
     <w:p>
@@ -1839,7 +2382,7 @@
           <w:color w:val="17255B"/>
           <w:sz w:val="22"/>
         </w:rPr>
-        <w:t>¿Tienes dudas?</w:t>
+        <w:t>Tienes dudas?</w:t>
       </w:r>
       <w:r>
         <w:rPr>
@@ -1849,7 +2392,7 @@
           <w:color w:val="17255B"/>
           <w:sz w:val="22"/>
         </w:rPr>
-        <w:t xml:space="preserve"> Pregunta antes de cambiar la plantilla. Una pregunta breve suele ahorrar una ronda de correcciones.</w:t>
+        <w:t xml:space="preserve"> Pregunta antes de cambiar las etiquetas de la plantilla. Una pregunta breve suele ahorrar una ronda completa de correcciones.</w:t>
       </w:r>
     </w:p>
     <w:sectPr>
@@ -1879,7 +2422,7 @@
         <w:color w:val="5F6878"/>
         <w:sz w:val="17"/>
       </w:rPr>
-      <w:t xml:space="preserve">Órbita · Aerospace AAFI     </w:t>
+      <w:t xml:space="preserve">Orbita ? Aerospace AAFI     </w:t>
     </w:r>
     <w:r>
       <w:rPr>
@@ -1914,7 +2457,7 @@
         <w:color w:val="506AB8"/>
         <w:sz w:val="17"/>
       </w:rPr>
-      <w:t>ÓRBITA  ·  GUÍA DE COLABORACIÓN</w:t>
+      <w:t>ORBITA  ?  GUIA DE COLABORACION</w:t>
     </w:r>
   </w:p>
 </w:hdr>

</xml_diff>